<commit_message>
hvac-designer: handle real traced multi-plan sheets; add DDA housing worked example
Reader: several plans per sheet split by title, glyph-outline-on-ink label
voting, cell-type window schedules, decimal-metre dimension strings,
courtyards/shafts treated as exterior, title-block/grid noise dropped,
polyline door arcs, area tolerance for traced drawings, window-size and
conditioned overrides from project.json, fill_from_floor helper for
typical flats. Equipment: per-system outdoor unit location (facade/roof),
one ducted unit per room option, roof outline fallback, DS-18 size.
DXF background simplified on heavy drawings. Second worked example:
4-storey DDA MIG housing block (16 flats) run end to end.

Co-Authored-By: Claude Fable 5.1 <noreply@anthropic.com>
Claude-Session: https://claude.ai/code/session_01WkbbzwcKHZubjtebdHFNYk
</commit_message>
<xml_diff>
--- a/.claude/skills/hvac-designer/examples/riyadh_villa/output/out/HVAC_Design_Report.docx
+++ b/.claude/skills/hvac-designer/examples/riyadh_villa/output/out/HVAC_Design_Report.docx
@@ -1911,7 +1911,7 @@
               <w:rPr>
                 <w:sz w:val="15"/>
               </w:rPr>
-              <w:t>0 + 1500 W</w:t>
+              <w:t>60 + 800 W</w:t>
             </w:r>
           </w:p>
         </w:tc>
@@ -4963,7 +4963,7 @@
               <w:rPr>
                 <w:sz w:val="14"/>
               </w:rPr>
-              <w:t>IU-GF-02 (WS-09) is 141 % above requirement - smallest catalogue size; consider combining zones or a smaller (VRF/wall) unit</w:t>
+              <w:t>IU-GF-02 (WS-09) is 161 % above requirement - smallest catalogue size; consider combining zones or a smaller (VRF/wall) unit</w:t>
             </w:r>
           </w:p>
         </w:tc>
@@ -5035,7 +5035,7 @@
               <w:rPr>
                 <w:sz w:val="14"/>
               </w:rPr>
-              <w:t>Z-GF-03 indoor unit in the ceiling void of GF-02 ENTRANCE HALL (service space next to the zone)</w:t>
+              <w:t>Z-GF-03: sensible capacity governs (3.8 kW sensible at catalogue SHR) - DS-24 chosen instead of DS-18; brand data at actual (dry) entering conditions may allow the smaller unit</w:t>
             </w:r>
           </w:p>
         </w:tc>
@@ -5049,7 +5049,7 @@
               <w:rPr>
                 <w:sz w:val="14"/>
               </w:rPr>
-              <w:t>references/design_defaults.json unit_host_preference</w:t>
+              <w:t>designer note</w:t>
             </w:r>
           </w:p>
         </w:tc>
@@ -5107,7 +5107,7 @@
               <w:rPr>
                 <w:sz w:val="14"/>
               </w:rPr>
-              <w:t>Z-GF-04: sensible capacity governs (8.2 kW sensible at catalogue SHR) - DS-48 chosen instead of DS-36; brand data at actual (dry) entering conditions may allow the smaller unit</w:t>
+              <w:t>Z-GF-03 indoor unit in the ceiling void of GF-02 ENTRANCE HALL (service space next to the zone)</w:t>
             </w:r>
           </w:p>
         </w:tc>
@@ -5121,7 +5121,7 @@
               <w:rPr>
                 <w:sz w:val="14"/>
               </w:rPr>
-              <w:t>designer note</w:t>
+              <w:t>references/design_defaults.json unit_host_preference</w:t>
             </w:r>
           </w:p>
         </w:tc>
@@ -5179,7 +5179,7 @@
               <w:rPr>
                 <w:sz w:val="14"/>
               </w:rPr>
-              <w:t>Z-GF-04 indoor unit in the ceiling void of GF-04 CORRIDOR (service space next to the zone)</w:t>
+              <w:t>Z-GF-04: sensible capacity governs (8.2 kW sensible at catalogue SHR) - DS-48 chosen instead of DS-36; brand data at actual (dry) entering conditions may allow the smaller unit</w:t>
             </w:r>
           </w:p>
         </w:tc>
@@ -5193,7 +5193,7 @@
               <w:rPr>
                 <w:sz w:val="14"/>
               </w:rPr>
-              <w:t>references/design_defaults.json unit_host_preference</w:t>
+              <w:t>designer note</w:t>
             </w:r>
           </w:p>
         </w:tc>
@@ -5251,7 +5251,7 @@
               <w:rPr>
                 <w:sz w:val="14"/>
               </w:rPr>
-              <w:t>IU-FF-01 (DS-24) is 127 % above requirement - smallest catalogue size; consider combining zones or a smaller (VRF/wall) unit</w:t>
+              <w:t>Z-GF-04 indoor unit in the ceiling void of GF-04 CORRIDOR (service space next to the zone)</w:t>
             </w:r>
           </w:p>
         </w:tc>
@@ -5265,7 +5265,7 @@
               <w:rPr>
                 <w:sz w:val="14"/>
               </w:rPr>
-              <w:t>designer note</w:t>
+              <w:t>references/design_defaults.json unit_host_preference</w:t>
             </w:r>
           </w:p>
         </w:tc>
@@ -5323,7 +5323,7 @@
               <w:rPr>
                 <w:sz w:val="14"/>
               </w:rPr>
-              <w:t>Z-FF-01 indoor unit in the ceiling void of FF-04 DRESSING (service space next to the zone)</w:t>
+              <w:t>IU-FF-01 (DS-18) is 72 % above requirement - smallest catalogue size; consider combining zones or a smaller (VRF/wall) unit</w:t>
             </w:r>
           </w:p>
         </w:tc>
@@ -5337,7 +5337,7 @@
               <w:rPr>
                 <w:sz w:val="14"/>
               </w:rPr>
-              <w:t>references/design_defaults.json unit_host_preference</w:t>
+              <w:t>designer note</w:t>
             </w:r>
           </w:p>
         </w:tc>
@@ -5395,7 +5395,7 @@
               <w:rPr>
                 <w:sz w:val="14"/>
               </w:rPr>
-              <w:t>Z-FF-02 indoor unit in the ceiling void of FF-07 LOBBY (service space next to the zone)</w:t>
+              <w:t>Z-FF-01 indoor unit in the ceiling void of FF-04 DRESSING (service space next to the zone)</w:t>
             </w:r>
           </w:p>
         </w:tc>
@@ -5467,7 +5467,7 @@
               <w:rPr>
                 <w:sz w:val="14"/>
               </w:rPr>
-              <w:t>Outdoor units grouped on the roof near the riser/shaft with 0.6 m service clearance; check structure, parapet height and acoustic screening</w:t>
+              <w:t>Z-FF-02 indoor unit in the ceiling void of FF-07 LOBBY (service space next to the zone)</w:t>
             </w:r>
           </w:p>
         </w:tc>
@@ -5481,7 +5481,7 @@
               <w:rPr>
                 <w:sz w:val="14"/>
               </w:rPr>
-              <w:t>designer judgement</w:t>
+              <w:t>references/design_defaults.json unit_host_preference</w:t>
             </w:r>
           </w:p>
         </w:tc>
@@ -5525,7 +5525,7 @@
               <w:rPr>
                 <w:sz w:val="14"/>
               </w:rPr>
-              <w:t>B-ducts</w:t>
+              <w:t>B-equip</w:t>
             </w:r>
           </w:p>
         </w:tc>
@@ -5539,7 +5539,7 @@
               <w:rPr>
                 <w:sz w:val="14"/>
               </w:rPr>
-              <w:t>Ducts sized by equal friction 0.8 Pa/m with velocity limits {'main': 5.0, 'branch': 3.5, 'runout': 2.5, 'return': 3.5, 'fresh_air': 4.0, 'exhaust': 4.0} m/s; max duct depth 300 mm from ceiling void</w:t>
+              <w:t>Outdoor units grouped on the roof near the riser/shaft with 0.6 m service clearance; check structure, parapet height and acoustic screening</w:t>
             </w:r>
           </w:p>
         </w:tc>
@@ -5553,7 +5553,7 @@
               <w:rPr>
                 <w:sz w:val="14"/>
               </w:rPr>
-              <w:t>ASHRAE Fundamentals 2021 Ch.21 (equal friction method, Eq.18-19 Altshul-Tsal)</w:t>
+              <w:t>designer judgement</w:t>
             </w:r>
           </w:p>
         </w:tc>
@@ -5567,7 +5567,7 @@
               <w:rPr>
                 <w:sz w:val="14"/>
               </w:rPr>
-              <w:t>default</w:t>
+              <w:t>CONFIRM</w:t>
             </w:r>
           </w:p>
         </w:tc>
@@ -5611,7 +5611,7 @@
               <w:rPr>
                 <w:sz w:val="14"/>
               </w:rPr>
-              <w:t>Fittings allowed as +50% equivalent length; unit plenum/filter 40.0 Pa</w:t>
+              <w:t>Ducts sized by equal friction 0.8 Pa/m with velocity limits {'main': 5.0, 'branch': 3.5, 'runout': 2.5, 'return': 3.5, 'fresh_air': 4.0, 'exhaust': 4.0} m/s; max duct depth 300 mm from ceiling void</w:t>
             </w:r>
           </w:p>
         </w:tc>
@@ -5625,7 +5625,7 @@
               <w:rPr>
                 <w:sz w:val="14"/>
               </w:rPr>
-              <w:t>designer default</w:t>
+              <w:t>ASHRAE Fundamentals 2021 Ch.21 (equal friction method, Eq.18-19 Altshul-Tsal)</w:t>
             </w:r>
           </w:p>
         </w:tc>
@@ -5639,7 +5639,7 @@
               <w:rPr>
                 <w:sz w:val="14"/>
               </w:rPr>
-              <w:t>CONFIRM</w:t>
+              <w:t>default</w:t>
             </w:r>
           </w:p>
         </w:tc>
@@ -5683,7 +5683,7 @@
               <w:rPr>
                 <w:sz w:val="14"/>
               </w:rPr>
-              <w:t>Duct routes are schematic trunk-and-branch lines over the plan; coordinate with structure (beams), lighting and other services</w:t>
+              <w:t>Fittings allowed as +50% equivalent length; unit plenum/filter 40.0 Pa</w:t>
             </w:r>
           </w:p>
         </w:tc>
@@ -5697,7 +5697,7 @@
               <w:rPr>
                 <w:sz w:val="14"/>
               </w:rPr>
-              <w:t>designer judgement</w:t>
+              <w:t>designer default</w:t>
             </w:r>
           </w:p>
         </w:tc>
@@ -5755,7 +5755,7 @@
               <w:rPr>
                 <w:sz w:val="14"/>
               </w:rPr>
-              <w:t>Return air from rooms via door undercut / door transfer grilles to the return grille near the unit</w:t>
+              <w:t>Duct routes are schematic trunk-and-branch lines over the plan; coordinate with structure (beams), lighting and other services</w:t>
             </w:r>
           </w:p>
         </w:tc>
@@ -5769,7 +5769,7 @@
               <w:rPr>
                 <w:sz w:val="14"/>
               </w:rPr>
-              <w:t>ASHRAE Fundamentals 2021 Ch.21 (equal friction method, Eq.18-19 Altshul-Tsal)</w:t>
+              <w:t>designer judgement</w:t>
             </w:r>
           </w:p>
         </w:tc>
@@ -5813,7 +5813,7 @@
               <w:rPr>
                 <w:sz w:val="14"/>
               </w:rPr>
-              <w:t>B-pipes</w:t>
+              <w:t>B-ducts</w:t>
             </w:r>
           </w:p>
         </w:tc>
@@ -5827,7 +5827,7 @@
               <w:rPr>
                 <w:sz w:val="14"/>
               </w:rPr>
-              <w:t>Refrigerant pipe sizes from GENERIC table (references/pipe_sizing.json) - replace with the selected brand's table</w:t>
+              <w:t>Return air from rooms via door undercut / door transfer grilles to the return grille near the unit</w:t>
             </w:r>
           </w:p>
         </w:tc>
@@ -5841,7 +5841,7 @@
               <w:rPr>
                 <w:sz w:val="14"/>
               </w:rPr>
-              <w:t>SBC 501 Ch.11 §1107 (refrigerant piping); ASHRAE 15; manufacturer piping tables</w:t>
+              <w:t>ASHRAE Fundamentals 2021 Ch.21 (equal friction method, Eq.18-19 Altshul-Tsal)</w:t>
             </w:r>
           </w:p>
         </w:tc>
@@ -5899,7 +5899,7 @@
               <w:rPr>
                 <w:sz w:val="14"/>
               </w:rPr>
-              <w:t>Refrigerant length = route x (1+10%) + vertical rise to roof (+1.5 m allowance)</w:t>
+              <w:t>Refrigerant pipe sizes from GENERIC table (references/pipe_sizing.json) - replace with the selected brand's table</w:t>
             </w:r>
           </w:p>
         </w:tc>
@@ -5913,7 +5913,7 @@
               <w:rPr>
                 <w:sz w:val="14"/>
               </w:rPr>
-              <w:t>designer default</w:t>
+              <w:t>SBC 501 Ch.11 §1107 (refrigerant piping); ASHRAE 15; manufacturer piping tables</w:t>
             </w:r>
           </w:p>
         </w:tc>
@@ -5927,7 +5927,7 @@
               <w:rPr>
                 <w:sz w:val="14"/>
               </w:rPr>
-              <w:t>default</w:t>
+              <w:t>CONFIRM</w:t>
             </w:r>
           </w:p>
         </w:tc>
@@ -5944,6 +5944,78 @@
                 <w:sz w:val="14"/>
               </w:rPr>
               <w:t>A042</w:t>
+            </w:r>
+          </w:p>
+        </w:tc>
+        <w:tc>
+          <w:tcPr>
+            <w:tcW w:type="dxa" w:w="1134"/>
+          </w:tcPr>
+          <w:p>
+            <w:r/>
+            <w:r>
+              <w:rPr>
+                <w:sz w:val="14"/>
+              </w:rPr>
+              <w:t>B-pipes</w:t>
+            </w:r>
+          </w:p>
+        </w:tc>
+        <w:tc>
+          <w:tcPr>
+            <w:tcW w:type="dxa" w:w="7370"/>
+          </w:tcPr>
+          <w:p>
+            <w:r/>
+            <w:r>
+              <w:rPr>
+                <w:sz w:val="14"/>
+              </w:rPr>
+              <w:t>Refrigerant length = route x (1+10%) + vertical rise to roof (+1.5 m allowance)</w:t>
+            </w:r>
+          </w:p>
+        </w:tc>
+        <w:tc>
+          <w:tcPr>
+            <w:tcW w:type="dxa" w:w="3402"/>
+          </w:tcPr>
+          <w:p>
+            <w:r/>
+            <w:r>
+              <w:rPr>
+                <w:sz w:val="14"/>
+              </w:rPr>
+              <w:t>designer default</w:t>
+            </w:r>
+          </w:p>
+        </w:tc>
+        <w:tc>
+          <w:tcPr>
+            <w:tcW w:type="dxa" w:w="1134"/>
+          </w:tcPr>
+          <w:p>
+            <w:r/>
+            <w:r>
+              <w:rPr>
+                <w:sz w:val="14"/>
+              </w:rPr>
+              <w:t>default</w:t>
+            </w:r>
+          </w:p>
+        </w:tc>
+      </w:tr>
+      <w:tr>
+        <w:tc>
+          <w:tcPr>
+            <w:tcW w:type="dxa" w:w="850"/>
+          </w:tcPr>
+          <w:p>
+            <w:r/>
+            <w:r>
+              <w:rPr>
+                <w:sz w:val="14"/>
+              </w:rPr>
+              <w:t>A043</w:t>
             </w:r>
           </w:p>
         </w:tc>
@@ -6230,7 +6302,7 @@
               <w:rPr>
                 <w:sz w:val="14"/>
               </w:rPr>
-              <w:t>27.79</w:t>
+              <w:t>27.47</w:t>
             </w:r>
           </w:p>
         </w:tc>
@@ -6258,7 +6330,7 @@
               <w:rPr>
                 <w:sz w:val="14"/>
               </w:rPr>
-              <w:t>N 5.7, W 4.68</w:t>
+              <w:t>N 5.73, W 4.77</w:t>
             </w:r>
           </w:p>
         </w:tc>
@@ -6486,7 +6558,7 @@
               <w:rPr>
                 <w:sz w:val="14"/>
               </w:rPr>
-              <w:t>30.32</w:t>
+              <w:t>29.91</w:t>
             </w:r>
           </w:p>
         </w:tc>
@@ -6514,7 +6586,7 @@
               <w:rPr>
                 <w:sz w:val="14"/>
               </w:rPr>
-              <w:t>N 6.21, E 4.7</w:t>
+              <w:t>N 6.24, E 4.76</w:t>
             </w:r>
           </w:p>
         </w:tc>
@@ -6742,7 +6814,7 @@
               <w:rPr>
                 <w:sz w:val="14"/>
               </w:rPr>
-              <w:t>21.31</w:t>
+              <w:t>21.12</w:t>
             </w:r>
           </w:p>
         </w:tc>
@@ -6770,7 +6842,7 @@
               <w:rPr>
                 <w:sz w:val="14"/>
               </w:rPr>
-              <w:t>W 4.35</w:t>
+              <w:t>W 4.41</w:t>
             </w:r>
           </w:p>
         </w:tc>
@@ -6998,7 +7070,7 @@
               <w:rPr>
                 <w:sz w:val="14"/>
               </w:rPr>
-              <w:t>12.99</w:t>
+              <w:t>12.88</w:t>
             </w:r>
           </w:p>
         </w:tc>
@@ -7026,7 +7098,7 @@
               <w:rPr>
                 <w:sz w:val="14"/>
               </w:rPr>
-              <w:t>E 3.84</w:t>
+              <w:t>E 3.9, S 0.73</w:t>
             </w:r>
           </w:p>
         </w:tc>
@@ -7040,7 +7112,7 @@
               <w:rPr>
                 <w:sz w:val="14"/>
               </w:rPr>
-              <w:t>W2 E 1.2x1.5</w:t>
+              <w:t>-</w:t>
             </w:r>
           </w:p>
         </w:tc>
@@ -7254,7 +7326,7 @@
               <w:rPr>
                 <w:sz w:val="14"/>
               </w:rPr>
-              <w:t>6.73</w:t>
+              <w:t>6.66</w:t>
             </w:r>
           </w:p>
         </w:tc>
@@ -7282,7 +7354,7 @@
               <w:rPr>
                 <w:sz w:val="14"/>
               </w:rPr>
-              <w:t>S 2.34</w:t>
+              <w:t>E 2.75, S 2.4</w:t>
             </w:r>
           </w:p>
         </w:tc>
@@ -7510,7 +7582,7 @@
               <w:rPr>
                 <w:sz w:val="14"/>
               </w:rPr>
-              <w:t>5.19</w:t>
+              <w:t>5.13</w:t>
             </w:r>
           </w:p>
         </w:tc>
@@ -7538,7 +7610,7 @@
               <w:rPr>
                 <w:sz w:val="14"/>
               </w:rPr>
-              <w:t>S 2.19, W 2.25</w:t>
+              <w:t>S 2.25, W 2.25</w:t>
             </w:r>
           </w:p>
         </w:tc>
@@ -7766,7 +7838,7 @@
               <w:rPr>
                 <w:sz w:val="14"/>
               </w:rPr>
-              <w:t>7.87</w:t>
+              <w:t>7.74</w:t>
             </w:r>
           </w:p>
         </w:tc>
@@ -7794,7 +7866,7 @@
               <w:rPr>
                 <w:sz w:val="14"/>
               </w:rPr>
-              <w:t>S 4.33</w:t>
+              <w:t>S 4.39</w:t>
             </w:r>
           </w:p>
         </w:tc>
@@ -7894,7 +7966,7 @@
               <w:rPr>
                 <w:sz w:val="14"/>
               </w:rPr>
-              <w:t>8.09</w:t>
+              <w:t>8.03</w:t>
             </w:r>
           </w:p>
         </w:tc>
@@ -7922,7 +7994,7 @@
               <w:rPr>
                 <w:sz w:val="14"/>
               </w:rPr>
-              <w:t>N 2.85</w:t>
+              <w:t>N 2.88</w:t>
             </w:r>
           </w:p>
         </w:tc>
@@ -8022,7 +8094,7 @@
               <w:rPr>
                 <w:sz w:val="14"/>
               </w:rPr>
-              <w:t>6.31</w:t>
+              <w:t>6.25</w:t>
             </w:r>
           </w:p>
         </w:tc>
@@ -8050,7 +8122,7 @@
               <w:rPr>
                 <w:sz w:val="14"/>
               </w:rPr>
-              <w:t>N 2.25, E 2.69</w:t>
+              <w:t>N 2.25, E 2.75</w:t>
             </w:r>
           </w:p>
         </w:tc>
@@ -8150,7 +8222,7 @@
               <w:rPr>
                 <w:sz w:val="14"/>
               </w:rPr>
-              <w:t>27.79</w:t>
+              <w:t>27.47</w:t>
             </w:r>
           </w:p>
         </w:tc>
@@ -8178,7 +8250,7 @@
               <w:rPr>
                 <w:sz w:val="14"/>
               </w:rPr>
-              <w:t>N 5.7, W 4.67</w:t>
+              <w:t>N 5.73, W 4.77</w:t>
             </w:r>
           </w:p>
         </w:tc>
@@ -8406,7 +8478,7 @@
               <w:rPr>
                 <w:sz w:val="14"/>
               </w:rPr>
-              <w:t>21.37</w:t>
+              <w:t>21.18</w:t>
             </w:r>
           </w:p>
         </w:tc>
@@ -8434,7 +8506,7 @@
               <w:rPr>
                 <w:sz w:val="14"/>
               </w:rPr>
-              <w:t>N 4.35</w:t>
+              <w:t>N 4.39</w:t>
             </w:r>
           </w:p>
         </w:tc>
@@ -8918,7 +8990,7 @@
               <w:rPr>
                 <w:sz w:val="14"/>
               </w:rPr>
-              <w:t>13.04</w:t>
+              <w:t>12.88</w:t>
             </w:r>
           </w:p>
         </w:tc>
@@ -8946,7 +9018,7 @@
               <w:rPr>
                 <w:sz w:val="14"/>
               </w:rPr>
-              <w:t>E 3.85</w:t>
+              <w:t>E 3.9, S 0.73</w:t>
             </w:r>
           </w:p>
         </w:tc>
@@ -9046,7 +9118,7 @@
               <w:rPr>
                 <w:sz w:val="14"/>
               </w:rPr>
-              <w:t>32.64</w:t>
+              <w:t>32.26</w:t>
             </w:r>
           </w:p>
         </w:tc>
@@ -9074,7 +9146,7 @@
               <w:rPr>
                 <w:sz w:val="14"/>
               </w:rPr>
-              <w:t>S 4.67, W 6.69</w:t>
+              <w:t>S 4.74, W 6.75</w:t>
             </w:r>
           </w:p>
         </w:tc>
@@ -9302,7 +9374,7 @@
               <w:rPr>
                 <w:sz w:val="14"/>
               </w:rPr>
-              <w:t>6.73</w:t>
+              <w:t>6.66</w:t>
             </w:r>
           </w:p>
         </w:tc>
@@ -9330,7 +9402,7 @@
               <w:rPr>
                 <w:sz w:val="14"/>
               </w:rPr>
-              <w:t>S 2.34</w:t>
+              <w:t>E 2.75, S 2.4</w:t>
             </w:r>
           </w:p>
         </w:tc>
@@ -9558,7 +9630,7 @@
               <w:rPr>
                 <w:sz w:val="14"/>
               </w:rPr>
-              <w:t>10.05</w:t>
+              <w:t>9.99</w:t>
             </w:r>
           </w:p>
         </w:tc>
@@ -9586,7 +9658,7 @@
               <w:rPr>
                 <w:sz w:val="14"/>
               </w:rPr>
-              <w:t>S 4.33</w:t>
+              <w:t>S 4.39</w:t>
             </w:r>
           </w:p>
         </w:tc>
@@ -10013,7 +10085,7 @@
               <w:rPr>
                 <w:sz w:val="13"/>
               </w:rPr>
-              <w:t>27.79</w:t>
+              <w:t>27.47</w:t>
             </w:r>
           </w:p>
         </w:tc>
@@ -10027,7 +10099,7 @@
               <w:rPr>
                 <w:sz w:val="13"/>
               </w:rPr>
-              <w:t>273.0</w:t>
+              <w:t>277.0</w:t>
             </w:r>
           </w:p>
         </w:tc>
@@ -10083,7 +10155,7 @@
               <w:rPr>
                 <w:sz w:val="13"/>
               </w:rPr>
-              <w:t>840.0</w:t>
+              <w:t>770.0</w:t>
             </w:r>
           </w:p>
         </w:tc>
@@ -10097,7 +10169,7 @@
               <w:rPr>
                 <w:sz w:val="13"/>
               </w:rPr>
-              <w:t>333.0</w:t>
+              <w:t>330.0</w:t>
             </w:r>
           </w:p>
         </w:tc>
@@ -10111,7 +10183,7 @@
               <w:rPr>
                 <w:sz w:val="13"/>
               </w:rPr>
-              <w:t>111.0</w:t>
+              <w:t>110.0</w:t>
             </w:r>
           </w:p>
         </w:tc>
@@ -10125,7 +10197,7 @@
               <w:rPr>
                 <w:sz w:val="13"/>
               </w:rPr>
-              <w:t>368.0</w:t>
+              <w:t>364.0</w:t>
             </w:r>
           </w:p>
         </w:tc>
@@ -10139,7 +10211,7 @@
               <w:rPr>
                 <w:sz w:val="13"/>
               </w:rPr>
-              <w:t>2501</w:t>
+              <w:t>2426</w:t>
             </w:r>
           </w:p>
         </w:tc>
@@ -10153,7 +10225,7 @@
               <w:rPr>
                 <w:sz w:val="13"/>
               </w:rPr>
-              <w:t>540</w:t>
+              <w:t>495</w:t>
             </w:r>
           </w:p>
         </w:tc>
@@ -10167,7 +10239,7 @@
               <w:rPr>
                 <w:sz w:val="13"/>
               </w:rPr>
-              <w:t>3041</w:t>
+              <w:t>2921</w:t>
             </w:r>
           </w:p>
         </w:tc>
@@ -10181,7 +10253,7 @@
               <w:rPr>
                 <w:sz w:val="13"/>
               </w:rPr>
-              <w:t>109.4</w:t>
+              <w:t>106.3</w:t>
             </w:r>
           </w:p>
         </w:tc>
@@ -10209,7 +10281,7 @@
               <w:rPr>
                 <w:sz w:val="13"/>
               </w:rPr>
-              <w:t>199 L/s</w:t>
+              <w:t>193 L/s</w:t>
             </w:r>
           </w:p>
         </w:tc>
@@ -10223,7 +10295,7 @@
               <w:rPr>
                 <w:sz w:val="13"/>
               </w:rPr>
-              <w:t>828</w:t>
+              <w:t>829</w:t>
             </w:r>
           </w:p>
         </w:tc>
@@ -10521,7 +10593,7 @@
               <w:rPr>
                 <w:sz w:val="13"/>
               </w:rPr>
-              <w:t>30.32</w:t>
+              <w:t>29.91</w:t>
             </w:r>
           </w:p>
         </w:tc>
@@ -10535,7 +10607,7 @@
               <w:rPr>
                 <w:sz w:val="13"/>
               </w:rPr>
-              <w:t>246.0</w:t>
+              <w:t>249.0</w:t>
             </w:r>
           </w:p>
         </w:tc>
@@ -10605,7 +10677,7 @@
               <w:rPr>
                 <w:sz w:val="13"/>
               </w:rPr>
-              <w:t>303.0</w:t>
+              <w:t>299.0</w:t>
             </w:r>
           </w:p>
         </w:tc>
@@ -10619,7 +10691,7 @@
               <w:rPr>
                 <w:sz w:val="13"/>
               </w:rPr>
-              <w:t>243.0</w:t>
+              <w:t>239.0</w:t>
             </w:r>
           </w:p>
         </w:tc>
@@ -10633,7 +10705,7 @@
               <w:rPr>
                 <w:sz w:val="13"/>
               </w:rPr>
-              <w:t>468.0</w:t>
+              <w:t>462.0</w:t>
             </w:r>
           </w:p>
         </w:tc>
@@ -10647,7 +10719,7 @@
               <w:rPr>
                 <w:sz w:val="13"/>
               </w:rPr>
-              <w:t>2468</w:t>
+              <w:t>2457</w:t>
             </w:r>
           </w:p>
         </w:tc>
@@ -10675,7 +10747,7 @@
               <w:rPr>
                 <w:sz w:val="13"/>
               </w:rPr>
-              <w:t>2828</w:t>
+              <w:t>2817</w:t>
             </w:r>
           </w:p>
         </w:tc>
@@ -10689,7 +10761,7 @@
               <w:rPr>
                 <w:sz w:val="13"/>
               </w:rPr>
-              <w:t>93.3</w:t>
+              <w:t>94.2</w:t>
             </w:r>
           </w:p>
         </w:tc>
@@ -10717,7 +10789,7 @@
               <w:rPr>
                 <w:sz w:val="13"/>
               </w:rPr>
-              <w:t>196 L/s</w:t>
+              <w:t>195 L/s</w:t>
             </w:r>
           </w:p>
         </w:tc>
@@ -10731,7 +10803,7 @@
               <w:rPr>
                 <w:sz w:val="13"/>
               </w:rPr>
-              <w:t>980</w:t>
+              <w:t>979</w:t>
             </w:r>
           </w:p>
         </w:tc>
@@ -11029,7 +11101,7 @@
               <w:rPr>
                 <w:sz w:val="13"/>
               </w:rPr>
-              <w:t>21.31</w:t>
+              <w:t>21.12</w:t>
             </w:r>
           </w:p>
         </w:tc>
@@ -11043,6 +11115,34 @@
               <w:rPr>
                 <w:sz w:val="13"/>
               </w:rPr>
+              <w:t>125.0</w:t>
+            </w:r>
+          </w:p>
+        </w:tc>
+        <w:tc>
+          <w:tcPr>
+            <w:tcW w:type="dxa" w:w="767"/>
+          </w:tcPr>
+          <w:p>
+            <w:r/>
+            <w:r>
+              <w:rPr>
+                <w:sz w:val="13"/>
+              </w:rPr>
+              <w:t>0.0</w:t>
+            </w:r>
+          </w:p>
+        </w:tc>
+        <w:tc>
+          <w:tcPr>
+            <w:tcW w:type="dxa" w:w="767"/>
+          </w:tcPr>
+          <w:p>
+            <w:r/>
+            <w:r>
+              <w:rPr>
+                <w:sz w:val="13"/>
+              </w:rPr>
               <w:t>123.0</w:t>
             </w:r>
           </w:p>
@@ -11057,7 +11157,7 @@
               <w:rPr>
                 <w:sz w:val="13"/>
               </w:rPr>
-              <w:t>0.0</w:t>
+              <w:t>418.0</w:t>
             </w:r>
           </w:p>
         </w:tc>
@@ -11071,7 +11171,7 @@
               <w:rPr>
                 <w:sz w:val="13"/>
               </w:rPr>
-              <w:t>123.0</w:t>
+              <w:t>630.0</w:t>
             </w:r>
           </w:p>
         </w:tc>
@@ -11085,7 +11185,7 @@
               <w:rPr>
                 <w:sz w:val="13"/>
               </w:rPr>
-              <w:t>418.0</w:t>
+              <w:t>211.0</w:t>
             </w:r>
           </w:p>
         </w:tc>
@@ -11099,7 +11199,7 @@
               <w:rPr>
                 <w:sz w:val="13"/>
               </w:rPr>
-              <w:t>630.0</w:t>
+              <w:t>63.0</w:t>
             </w:r>
           </w:p>
         </w:tc>
@@ -11113,7 +11213,7 @@
               <w:rPr>
                 <w:sz w:val="13"/>
               </w:rPr>
-              <w:t>213.0</w:t>
+              <w:t>186.0</w:t>
             </w:r>
           </w:p>
         </w:tc>
@@ -11127,7 +11227,7 @@
               <w:rPr>
                 <w:sz w:val="13"/>
               </w:rPr>
-              <w:t>64.0</w:t>
+              <w:t>1757</w:t>
             </w:r>
           </w:p>
         </w:tc>
@@ -11141,7 +11241,7 @@
               <w:rPr>
                 <w:sz w:val="13"/>
               </w:rPr>
-              <w:t>188.0</w:t>
+              <w:t>405</w:t>
             </w:r>
           </w:p>
         </w:tc>
@@ -11155,7 +11255,7 @@
               <w:rPr>
                 <w:sz w:val="13"/>
               </w:rPr>
-              <w:t>1759</w:t>
+              <w:t>2162</w:t>
             </w:r>
           </w:p>
         </w:tc>
@@ -11169,7 +11269,7 @@
               <w:rPr>
                 <w:sz w:val="13"/>
               </w:rPr>
-              <w:t>405</w:t>
+              <w:t>102.4</w:t>
             </w:r>
           </w:p>
         </w:tc>
@@ -11183,7 +11283,7 @@
               <w:rPr>
                 <w:sz w:val="13"/>
               </w:rPr>
-              <w:t>2164</w:t>
+              <w:t>18:00</w:t>
             </w:r>
           </w:p>
         </w:tc>
@@ -11197,7 +11297,7 @@
               <w:rPr>
                 <w:sz w:val="13"/>
               </w:rPr>
-              <w:t>101.5</w:t>
+              <w:t>140 L/s</w:t>
             </w:r>
           </w:p>
         </w:tc>
@@ -11211,35 +11311,7 @@
               <w:rPr>
                 <w:sz w:val="13"/>
               </w:rPr>
-              <w:t>18:00</w:t>
-            </w:r>
-          </w:p>
-        </w:tc>
-        <w:tc>
-          <w:tcPr>
-            <w:tcW w:type="dxa" w:w="767"/>
-          </w:tcPr>
-          <w:p>
-            <w:r/>
-            <w:r>
-              <w:rPr>
-                <w:sz w:val="13"/>
-              </w:rPr>
-              <w:t>140 L/s</w:t>
-            </w:r>
-          </w:p>
-        </w:tc>
-        <w:tc>
-          <w:tcPr>
-            <w:tcW w:type="dxa" w:w="767"/>
-          </w:tcPr>
-          <w:p>
-            <w:r/>
-            <w:r>
-              <w:rPr>
-                <w:sz w:val="13"/>
-              </w:rPr>
-              <w:t>400</w:t>
+              <w:t>401</w:t>
             </w:r>
           </w:p>
         </w:tc>
@@ -11381,7 +11453,7 @@
               <w:rPr>
                 <w:sz w:val="13"/>
               </w:rPr>
-              <w:t>1500.0</w:t>
+              <w:t>2115.0</w:t>
             </w:r>
           </w:p>
         </w:tc>
@@ -11409,7 +11481,7 @@
               <w:rPr>
                 <w:sz w:val="13"/>
               </w:rPr>
-              <w:t>1879</w:t>
+              <w:t>2494</w:t>
             </w:r>
           </w:p>
         </w:tc>
@@ -11423,7 +11495,7 @@
               <w:rPr>
                 <w:sz w:val="13"/>
               </w:rPr>
-              <w:t>660</w:t>
+              <w:t>460</w:t>
             </w:r>
           </w:p>
         </w:tc>
@@ -11437,7 +11509,7 @@
               <w:rPr>
                 <w:sz w:val="13"/>
               </w:rPr>
-              <w:t>2539</w:t>
+              <w:t>2954</w:t>
             </w:r>
           </w:p>
         </w:tc>
@@ -11451,7 +11523,7 @@
               <w:rPr>
                 <w:sz w:val="13"/>
               </w:rPr>
-              <w:t>115.8</w:t>
+              <w:t>134.8</w:t>
             </w:r>
           </w:p>
         </w:tc>
@@ -11479,7 +11551,7 @@
               <w:rPr>
                 <w:sz w:val="13"/>
               </w:rPr>
-              <w:t>149 L/s</w:t>
+              <w:t>198 L/s</w:t>
             </w:r>
           </w:p>
         </w:tc>
@@ -11537,7 +11609,7 @@
               <w:rPr>
                 <w:sz w:val="13"/>
               </w:rPr>
-              <w:t>12.99</w:t>
+              <w:t>12.88</w:t>
             </w:r>
           </w:p>
         </w:tc>
@@ -11551,7 +11623,7 @@
               <w:rPr>
                 <w:sz w:val="13"/>
               </w:rPr>
-              <w:t>81.0</w:t>
+              <w:t>147.0</w:t>
             </w:r>
           </w:p>
         </w:tc>
@@ -11579,7 +11651,7 @@
               <w:rPr>
                 <w:sz w:val="13"/>
               </w:rPr>
-              <w:t>55.0</w:t>
+              <w:t>0.0</w:t>
             </w:r>
           </w:p>
         </w:tc>
@@ -11593,7 +11665,7 @@
               <w:rPr>
                 <w:sz w:val="13"/>
               </w:rPr>
-              <w:t>286.0</w:t>
+              <w:t>0.0</w:t>
             </w:r>
           </w:p>
         </w:tc>
@@ -11621,7 +11693,7 @@
               <w:rPr>
                 <w:sz w:val="13"/>
               </w:rPr>
-              <w:t>104.0</w:t>
+              <w:t>103.0</w:t>
             </w:r>
           </w:p>
         </w:tc>
@@ -11635,7 +11707,7 @@
               <w:rPr>
                 <w:sz w:val="13"/>
               </w:rPr>
-              <w:t>65.0</w:t>
+              <w:t>64.0</w:t>
             </w:r>
           </w:p>
         </w:tc>
@@ -11649,7 +11721,7 @@
               <w:rPr>
                 <w:sz w:val="13"/>
               </w:rPr>
-              <w:t>70.0</w:t>
+              <w:t>199.0</w:t>
             </w:r>
           </w:p>
         </w:tc>
@@ -11663,7 +11735,7 @@
               <w:rPr>
                 <w:sz w:val="13"/>
               </w:rPr>
-              <w:t>720</w:t>
+              <w:t>573</w:t>
             </w:r>
           </w:p>
         </w:tc>
@@ -11691,7 +11763,7 @@
               <w:rPr>
                 <w:sz w:val="13"/>
               </w:rPr>
-              <w:t>745</w:t>
+              <w:t>598</w:t>
             </w:r>
           </w:p>
         </w:tc>
@@ -11705,7 +11777,7 @@
               <w:rPr>
                 <w:sz w:val="13"/>
               </w:rPr>
-              <w:t>57.4</w:t>
+              <w:t>46.5</w:t>
             </w:r>
           </w:p>
         </w:tc>
@@ -11719,7 +11791,7 @@
               <w:rPr>
                 <w:sz w:val="13"/>
               </w:rPr>
-              <w:t>9:00</w:t>
+              <w:t>15:00</w:t>
             </w:r>
           </w:p>
         </w:tc>
@@ -11733,7 +11805,7 @@
               <w:rPr>
                 <w:sz w:val="13"/>
               </w:rPr>
-              <w:t>57 L/s</w:t>
+              <w:t>46 L/s</w:t>
             </w:r>
           </w:p>
         </w:tc>
@@ -11747,7 +11819,7 @@
               <w:rPr>
                 <w:sz w:val="13"/>
               </w:rPr>
-              <w:t>294</w:t>
+              <w:t>309</w:t>
             </w:r>
           </w:p>
         </w:tc>
@@ -12045,7 +12117,7 @@
               <w:rPr>
                 <w:sz w:val="13"/>
               </w:rPr>
-              <w:t>27.79</w:t>
+              <w:t>27.47</w:t>
             </w:r>
           </w:p>
         </w:tc>
@@ -12059,7 +12131,7 @@
               <w:rPr>
                 <w:sz w:val="13"/>
               </w:rPr>
-              <w:t>273.0</w:t>
+              <w:t>277.0</w:t>
             </w:r>
           </w:p>
         </w:tc>
@@ -12073,7 +12145,7 @@
               <w:rPr>
                 <w:sz w:val="13"/>
               </w:rPr>
-              <w:t>172.0</w:t>
+              <w:t>170.0</w:t>
             </w:r>
           </w:p>
         </w:tc>
@@ -12129,7 +12201,7 @@
               <w:rPr>
                 <w:sz w:val="13"/>
               </w:rPr>
-              <w:t>222.0</w:t>
+              <w:t>220.0</w:t>
             </w:r>
           </w:p>
         </w:tc>
@@ -12143,7 +12215,7 @@
               <w:rPr>
                 <w:sz w:val="13"/>
               </w:rPr>
-              <w:t>167.0</w:t>
+              <w:t>165.0</w:t>
             </w:r>
           </w:p>
         </w:tc>
@@ -12157,7 +12229,7 @@
               <w:rPr>
                 <w:sz w:val="13"/>
               </w:rPr>
-              <w:t>368.0</w:t>
+              <w:t>364.0</w:t>
             </w:r>
           </w:p>
         </w:tc>
@@ -12171,7 +12243,7 @@
               <w:rPr>
                 <w:sz w:val="13"/>
               </w:rPr>
-              <w:t>1897</w:t>
+              <w:t>1891</w:t>
             </w:r>
           </w:p>
         </w:tc>
@@ -12199,7 +12271,7 @@
               <w:rPr>
                 <w:sz w:val="13"/>
               </w:rPr>
-              <w:t>1947</w:t>
+              <w:t>1941</w:t>
             </w:r>
           </w:p>
         </w:tc>
@@ -12213,7 +12285,7 @@
               <w:rPr>
                 <w:sz w:val="13"/>
               </w:rPr>
-              <w:t>70.1</w:t>
+              <w:t>70.6</w:t>
             </w:r>
           </w:p>
         </w:tc>
@@ -12241,7 +12313,7 @@
               <w:rPr>
                 <w:sz w:val="13"/>
               </w:rPr>
-              <w:t>151 L/s</w:t>
+              <w:t>150 L/s</w:t>
             </w:r>
           </w:p>
         </w:tc>
@@ -12255,7 +12327,7 @@
               <w:rPr>
                 <w:sz w:val="13"/>
               </w:rPr>
-              <w:t>728</w:t>
+              <w:t>727</w:t>
             </w:r>
           </w:p>
         </w:tc>
@@ -12553,7 +12625,7 @@
               <w:rPr>
                 <w:sz w:val="13"/>
               </w:rPr>
-              <w:t>21.37</w:t>
+              <w:t>21.18</w:t>
             </w:r>
           </w:p>
         </w:tc>
@@ -12567,7 +12639,7 @@
               <w:rPr>
                 <w:sz w:val="13"/>
               </w:rPr>
-              <w:t>85.0</w:t>
+              <w:t>86.0</w:t>
             </w:r>
           </w:p>
         </w:tc>
@@ -12581,7 +12653,7 @@
               <w:rPr>
                 <w:sz w:val="13"/>
               </w:rPr>
-              <w:t>123.0</w:t>
+              <w:t>122.0</w:t>
             </w:r>
           </w:p>
         </w:tc>
@@ -12637,7 +12709,7 @@
               <w:rPr>
                 <w:sz w:val="13"/>
               </w:rPr>
-              <w:t>171.0</w:t>
+              <w:t>169.0</w:t>
             </w:r>
           </w:p>
         </w:tc>
@@ -12651,7 +12723,7 @@
               <w:rPr>
                 <w:sz w:val="13"/>
               </w:rPr>
-              <w:t>107.0</w:t>
+              <w:t>106.0</w:t>
             </w:r>
           </w:p>
         </w:tc>
@@ -12665,7 +12737,7 @@
               <w:rPr>
                 <w:sz w:val="13"/>
               </w:rPr>
-              <w:t>220.0</w:t>
+              <w:t>218.0</w:t>
             </w:r>
           </w:p>
         </w:tc>
@@ -12679,7 +12751,7 @@
               <w:rPr>
                 <w:sz w:val="13"/>
               </w:rPr>
-              <w:t>1039</w:t>
+              <w:t>1035</w:t>
             </w:r>
           </w:p>
         </w:tc>
@@ -12707,7 +12779,7 @@
               <w:rPr>
                 <w:sz w:val="13"/>
               </w:rPr>
-              <w:t>1089</w:t>
+              <w:t>1085</w:t>
             </w:r>
           </w:p>
         </w:tc>
@@ -12721,7 +12793,7 @@
               <w:rPr>
                 <w:sz w:val="13"/>
               </w:rPr>
-              <w:t>51.0</w:t>
+              <w:t>51.2</w:t>
             </w:r>
           </w:p>
         </w:tc>
@@ -12749,7 +12821,7 @@
               <w:rPr>
                 <w:sz w:val="13"/>
               </w:rPr>
-              <w:t>83 L/s</w:t>
+              <w:t>82 L/s</w:t>
             </w:r>
           </w:p>
         </w:tc>
@@ -12763,7 +12835,7 @@
               <w:rPr>
                 <w:sz w:val="13"/>
               </w:rPr>
-              <w:t>387</w:t>
+              <w:t>386</w:t>
             </w:r>
           </w:p>
         </w:tc>
@@ -13315,7 +13387,7 @@
               <w:rPr>
                 <w:sz w:val="13"/>
               </w:rPr>
-              <w:t>13.04</w:t>
+              <w:t>12.88</w:t>
             </w:r>
           </w:p>
         </w:tc>
@@ -13329,7 +13401,7 @@
               <w:rPr>
                 <w:sz w:val="13"/>
               </w:rPr>
-              <w:t>75.0</w:t>
+              <w:t>86.0</w:t>
             </w:r>
           </w:p>
         </w:tc>
@@ -13343,7 +13415,7 @@
               <w:rPr>
                 <w:sz w:val="13"/>
               </w:rPr>
-              <w:t>36.0</w:t>
+              <w:t>35.0</w:t>
             </w:r>
           </w:p>
         </w:tc>
@@ -13399,7 +13471,7 @@
               <w:rPr>
                 <w:sz w:val="13"/>
               </w:rPr>
-              <w:t>104.0</w:t>
+              <w:t>103.0</w:t>
             </w:r>
           </w:p>
         </w:tc>
@@ -13413,7 +13485,7 @@
               <w:rPr>
                 <w:sz w:val="13"/>
               </w:rPr>
-              <w:t>65.0</w:t>
+              <w:t>64.0</w:t>
             </w:r>
           </w:p>
         </w:tc>
@@ -13427,7 +13499,7 @@
               <w:rPr>
                 <w:sz w:val="13"/>
               </w:rPr>
-              <w:t>70.0</w:t>
+              <w:t>103.0</w:t>
             </w:r>
           </w:p>
         </w:tc>
@@ -13441,7 +13513,7 @@
               <w:rPr>
                 <w:sz w:val="13"/>
               </w:rPr>
-              <w:t>982</w:t>
+              <w:t>1023</w:t>
             </w:r>
           </w:p>
         </w:tc>
@@ -13469,7 +13541,7 @@
               <w:rPr>
                 <w:sz w:val="13"/>
               </w:rPr>
-              <w:t>1032</w:t>
+              <w:t>1073</w:t>
             </w:r>
           </w:p>
         </w:tc>
@@ -13483,7 +13555,7 @@
               <w:rPr>
                 <w:sz w:val="13"/>
               </w:rPr>
-              <w:t>79.1</w:t>
+              <w:t>83.3</w:t>
             </w:r>
           </w:p>
         </w:tc>
@@ -13511,7 +13583,7 @@
               <w:rPr>
                 <w:sz w:val="13"/>
               </w:rPr>
-              <w:t>78 L/s</w:t>
+              <w:t>81 L/s</w:t>
             </w:r>
           </w:p>
         </w:tc>
@@ -13525,7 +13597,7 @@
               <w:rPr>
                 <w:sz w:val="13"/>
               </w:rPr>
-              <w:t>295</w:t>
+              <w:t>354</w:t>
             </w:r>
           </w:p>
         </w:tc>
@@ -13569,7 +13641,7 @@
               <w:rPr>
                 <w:sz w:val="13"/>
               </w:rPr>
-              <w:t>32.64</w:t>
+              <w:t>32.26</w:t>
             </w:r>
           </w:p>
         </w:tc>
@@ -13583,7 +13655,7 @@
               <w:rPr>
                 <w:sz w:val="13"/>
               </w:rPr>
-              <w:t>285.0</w:t>
+              <w:t>289.0</w:t>
             </w:r>
           </w:p>
         </w:tc>
@@ -13597,7 +13669,7 @@
               <w:rPr>
                 <w:sz w:val="13"/>
               </w:rPr>
-              <w:t>202.0</w:t>
+              <w:t>200.0</w:t>
             </w:r>
           </w:p>
         </w:tc>
@@ -13653,7 +13725,7 @@
               <w:rPr>
                 <w:sz w:val="13"/>
               </w:rPr>
-              <w:t>326.0</w:t>
+              <w:t>323.0</w:t>
             </w:r>
           </w:p>
         </w:tc>
@@ -13667,7 +13739,7 @@
               <w:rPr>
                 <w:sz w:val="13"/>
               </w:rPr>
-              <w:t>261.0</w:t>
+              <w:t>258.0</w:t>
             </w:r>
           </w:p>
         </w:tc>
@@ -13681,7 +13753,7 @@
               <w:rPr>
                 <w:sz w:val="13"/>
               </w:rPr>
-              <w:t>432.0</w:t>
+              <w:t>427.0</w:t>
             </w:r>
           </w:p>
         </w:tc>
@@ -13695,7 +13767,7 @@
               <w:rPr>
                 <w:sz w:val="13"/>
               </w:rPr>
-              <w:t>3270</w:t>
+              <w:t>3259</w:t>
             </w:r>
           </w:p>
         </w:tc>
@@ -13723,7 +13795,7 @@
               <w:rPr>
                 <w:sz w:val="13"/>
               </w:rPr>
-              <w:t>3675</w:t>
+              <w:t>3664</w:t>
             </w:r>
           </w:p>
         </w:tc>
@@ -13737,7 +13809,7 @@
               <w:rPr>
                 <w:sz w:val="13"/>
               </w:rPr>
-              <w:t>112.6</w:t>
+              <w:t>113.6</w:t>
             </w:r>
           </w:p>
         </w:tc>
@@ -13765,7 +13837,7 @@
               <w:rPr>
                 <w:sz w:val="13"/>
               </w:rPr>
-              <w:t>260 L/s</w:t>
+              <w:t>259 L/s</w:t>
             </w:r>
           </w:p>
         </w:tc>
@@ -13779,7 +13851,7 @@
               <w:rPr>
                 <w:sz w:val="13"/>
               </w:rPr>
-              <w:t>889</w:t>
+              <w:t>887</w:t>
             </w:r>
           </w:p>
         </w:tc>
@@ -14042,7 +14114,7 @@
     <w:p/>
     <w:p>
       <w:r>
-        <w:t>Conditioned area 290.6 m²; sum of room peaks 20.9 kW; block peak 20.5 kW at 17:00 (70 W/m²); heating 5.5 kW. Safety factors are applied at equipment selection (section 5).</w:t>
+        <w:t>Conditioned area 288.5 m²; sum of room peaks 21.1 kW; block peak 20.8 kW at 17:00 (72 W/m²); heating 5.6 kW. Safety factors are applied at equipment selection (section 5).</w:t>
       </w:r>
     </w:p>
     <w:p>
@@ -14122,7 +14194,7 @@
               <w:rPr>
                 <w:sz w:val="15"/>
               </w:rPr>
-              <w:t>U 0.4 × A 15.01 m² (gross 16.81)</w:t>
+              <w:t>U 0.4 × A 15.26 m² (gross 17.06)</w:t>
             </w:r>
           </w:p>
         </w:tc>
@@ -14152,7 +14224,7 @@
               <w:rPr>
                 <w:sz w:val="15"/>
               </w:rPr>
-              <w:t>U 0.4 × A 19.04 m² (gross 24.08)</w:t>
+              <w:t>U 0.4 × A 19.26 m² (gross 24.3)</w:t>
             </w:r>
           </w:p>
         </w:tc>
@@ -14242,7 +14314,7 @@
               <w:rPr>
                 <w:sz w:val="15"/>
               </w:rPr>
-              <w:t>U 0.2 × 32.64 m²</w:t>
+              <w:t>U 0.2 × 32.26 m²</w:t>
             </w:r>
           </w:p>
         </w:tc>
@@ -14302,7 +14374,7 @@
               <w:rPr>
                 <w:sz w:val="15"/>
               </w:rPr>
-              <w:t>0.75 ACH × 97.9 m³ = 20.4 L/s</w:t>
+              <w:t>0.75 ACH × 96.8 m³ = 20.2 L/s</w:t>
             </w:r>
           </w:p>
         </w:tc>
@@ -14332,7 +14404,7 @@
               <w:rPr>
                 <w:sz w:val="15"/>
               </w:rPr>
-              <w:t>285.0 W</w:t>
+              <w:t>289.0 W</w:t>
             </w:r>
           </w:p>
         </w:tc>
@@ -14362,7 +14434,7 @@
               <w:rPr>
                 <w:sz w:val="15"/>
               </w:rPr>
-              <w:t>202.0 W</w:t>
+              <w:t>200.0 W</w:t>
             </w:r>
           </w:p>
         </w:tc>
@@ -14482,7 +14554,7 @@
               <w:rPr>
                 <w:sz w:val="15"/>
               </w:rPr>
-              <w:t>326.0 W</w:t>
+              <w:t>323.0 W</w:t>
             </w:r>
           </w:p>
         </w:tc>
@@ -14512,7 +14584,7 @@
               <w:rPr>
                 <w:sz w:val="15"/>
               </w:rPr>
-              <w:t>261.0 W</w:t>
+              <w:t>258.0 W</w:t>
             </w:r>
           </w:p>
         </w:tc>
@@ -14542,7 +14614,7 @@
               <w:rPr>
                 <w:sz w:val="15"/>
               </w:rPr>
-              <w:t>432.0 W</w:t>
+              <w:t>427.0 W</w:t>
             </w:r>
           </w:p>
         </w:tc>
@@ -14662,7 +14734,7 @@
               <w:rPr>
                 <w:sz w:val="15"/>
               </w:rPr>
-              <w:t>3270 / 405 / 3675 W</w:t>
+              <w:t>3259 / 405 / 3664 W</w:t>
             </w:r>
           </w:p>
         </w:tc>
@@ -14692,7 +14764,7 @@
               <w:rPr>
                 <w:sz w:val="15"/>
               </w:rPr>
-              <w:t>3270 W / (1.143 × (24.0 − 13.0)) = 260.0 L/s</w:t>
+              <w:t>3259 W / (1.143 × (24.0 − 13.0)) = 259.1 L/s</w:t>
             </w:r>
           </w:p>
         </w:tc>
@@ -15173,7 +15245,7 @@
               <w:rPr>
                 <w:sz w:val="14"/>
               </w:rPr>
-              <w:t>12.99</w:t>
+              <w:t>12.88</w:t>
             </w:r>
           </w:p>
         </w:tc>
@@ -15329,7 +15401,7 @@
               <w:rPr>
                 <w:sz w:val="14"/>
               </w:rPr>
-              <w:t>12</w:t>
+              <w:t>11</w:t>
             </w:r>
           </w:p>
         </w:tc>
@@ -15343,7 +15415,7 @@
               <w:rPr>
                 <w:sz w:val="14"/>
               </w:rPr>
-              <w:t>27.79</w:t>
+              <w:t>27.47</w:t>
             </w:r>
           </w:p>
         </w:tc>
@@ -15357,7 +15429,7 @@
               <w:rPr>
                 <w:sz w:val="14"/>
               </w:rPr>
-              <w:t>30.0</w:t>
+              <w:t>27.5</w:t>
             </w:r>
           </w:p>
         </w:tc>
@@ -15371,7 +15443,7 @@
               <w:rPr>
                 <w:sz w:val="14"/>
               </w:rPr>
-              <w:t>8.3</w:t>
+              <w:t>8.2</w:t>
             </w:r>
           </w:p>
         </w:tc>
@@ -15385,7 +15457,7 @@
               <w:rPr>
                 <w:sz w:val="14"/>
               </w:rPr>
-              <w:t>38.3</w:t>
+              <w:t>35.7</w:t>
             </w:r>
           </w:p>
         </w:tc>
@@ -15427,7 +15499,7 @@
               <w:rPr>
                 <w:sz w:val="14"/>
               </w:rPr>
-              <w:t>47.9</w:t>
+              <w:t>44.7</w:t>
             </w:r>
           </w:p>
         </w:tc>
@@ -15513,7 +15585,7 @@
               <w:rPr>
                 <w:sz w:val="14"/>
               </w:rPr>
-              <w:t>21.31</w:t>
+              <w:t>21.12</w:t>
             </w:r>
           </w:p>
         </w:tc>
@@ -15541,7 +15613,7 @@
               <w:rPr>
                 <w:sz w:val="14"/>
               </w:rPr>
-              <w:t>6.4</w:t>
+              <w:t>6.3</w:t>
             </w:r>
           </w:p>
         </w:tc>
@@ -15555,7 +15627,7 @@
               <w:rPr>
                 <w:sz w:val="14"/>
               </w:rPr>
-              <w:t>28.9</w:t>
+              <w:t>28.8</w:t>
             </w:r>
           </w:p>
         </w:tc>
@@ -15597,7 +15669,7 @@
               <w:rPr>
                 <w:sz w:val="14"/>
               </w:rPr>
-              <w:t>106.3</w:t>
+              <w:t>106.1</w:t>
             </w:r>
           </w:p>
         </w:tc>
@@ -15767,7 +15839,7 @@
               <w:rPr>
                 <w:sz w:val="14"/>
               </w:rPr>
-              <w:t>106.3</w:t>
+              <w:t>106.1</w:t>
             </w:r>
           </w:p>
         </w:tc>
@@ -15937,7 +16009,7 @@
               <w:rPr>
                 <w:sz w:val="14"/>
               </w:rPr>
-              <w:t>106.3</w:t>
+              <w:t>106.1</w:t>
             </w:r>
           </w:p>
         </w:tc>
@@ -16107,7 +16179,7 @@
               <w:rPr>
                 <w:sz w:val="14"/>
               </w:rPr>
-              <w:t>106.3</w:t>
+              <w:t>106.1</w:t>
             </w:r>
           </w:p>
         </w:tc>
@@ -16193,7 +16265,7 @@
               <w:rPr>
                 <w:sz w:val="14"/>
               </w:rPr>
-              <w:t>30.32</w:t>
+              <w:t>29.91</w:t>
             </w:r>
           </w:p>
         </w:tc>
@@ -16221,7 +16293,7 @@
               <w:rPr>
                 <w:sz w:val="14"/>
               </w:rPr>
-              <w:t>9.1</w:t>
+              <w:t>9.0</w:t>
             </w:r>
           </w:p>
         </w:tc>
@@ -16235,7 +16307,7 @@
               <w:rPr>
                 <w:sz w:val="14"/>
               </w:rPr>
-              <w:t>29.1</w:t>
+              <w:t>29.0</w:t>
             </w:r>
           </w:p>
         </w:tc>
@@ -16277,7 +16349,7 @@
               <w:rPr>
                 <w:sz w:val="14"/>
               </w:rPr>
-              <w:t>106.3</w:t>
+              <w:t>106.1</w:t>
             </w:r>
           </w:p>
         </w:tc>
@@ -16363,7 +16435,7 @@
               <w:rPr>
                 <w:sz w:val="14"/>
               </w:rPr>
-              <w:t>27.79</w:t>
+              <w:t>27.47</w:t>
             </w:r>
           </w:p>
         </w:tc>
@@ -16391,7 +16463,7 @@
               <w:rPr>
                 <w:sz w:val="14"/>
               </w:rPr>
-              <w:t>8.3</w:t>
+              <w:t>8.2</w:t>
             </w:r>
           </w:p>
         </w:tc>
@@ -16405,7 +16477,7 @@
               <w:rPr>
                 <w:sz w:val="14"/>
               </w:rPr>
-              <w:t>13.3</w:t>
+              <w:t>13.2</w:t>
             </w:r>
           </w:p>
         </w:tc>
@@ -16447,7 +16519,7 @@
               <w:rPr>
                 <w:sz w:val="14"/>
               </w:rPr>
-              <w:t>20.1</w:t>
+              <w:t>19.9</w:t>
             </w:r>
           </w:p>
         </w:tc>
@@ -16617,7 +16689,7 @@
               <w:rPr>
                 <w:sz w:val="14"/>
               </w:rPr>
-              <w:t>20.1</w:t>
+              <w:t>19.9</w:t>
             </w:r>
           </w:p>
         </w:tc>
@@ -16703,7 +16775,7 @@
               <w:rPr>
                 <w:sz w:val="14"/>
               </w:rPr>
-              <w:t>32.64</w:t>
+              <w:t>32.26</w:t>
             </w:r>
           </w:p>
         </w:tc>
@@ -16731,7 +16803,7 @@
               <w:rPr>
                 <w:sz w:val="14"/>
               </w:rPr>
-              <w:t>9.8</w:t>
+              <w:t>9.7</w:t>
             </w:r>
           </w:p>
         </w:tc>
@@ -16745,7 +16817,7 @@
               <w:rPr>
                 <w:sz w:val="14"/>
               </w:rPr>
-              <w:t>32.3</w:t>
+              <w:t>32.2</w:t>
             </w:r>
           </w:p>
         </w:tc>
@@ -16787,7 +16859,7 @@
               <w:rPr>
                 <w:sz w:val="14"/>
               </w:rPr>
-              <w:t>92.6</w:t>
+              <w:t>92.3</w:t>
             </w:r>
           </w:p>
         </w:tc>
@@ -16957,7 +17029,7 @@
               <w:rPr>
                 <w:sz w:val="14"/>
               </w:rPr>
-              <w:t>92.6</w:t>
+              <w:t>92.3</w:t>
             </w:r>
           </w:p>
         </w:tc>
@@ -17127,7 +17199,7 @@
               <w:rPr>
                 <w:sz w:val="14"/>
               </w:rPr>
-              <w:t>92.6</w:t>
+              <w:t>92.3</w:t>
             </w:r>
           </w:p>
         </w:tc>
@@ -17297,7 +17369,7 @@
               <w:rPr>
                 <w:sz w:val="14"/>
               </w:rPr>
-              <w:t>92.6</w:t>
+              <w:t>92.3</w:t>
             </w:r>
           </w:p>
         </w:tc>
@@ -17383,7 +17455,7 @@
               <w:rPr>
                 <w:sz w:val="14"/>
               </w:rPr>
-              <w:t>21.37</w:t>
+              <w:t>21.18</w:t>
             </w:r>
           </w:p>
         </w:tc>
@@ -17467,7 +17539,7 @@
               <w:rPr>
                 <w:sz w:val="14"/>
               </w:rPr>
-              <w:t>92.6</w:t>
+              <w:t>92.3</w:t>
             </w:r>
           </w:p>
         </w:tc>
@@ -17553,7 +17625,7 @@
               <w:rPr>
                 <w:sz w:val="14"/>
               </w:rPr>
-              <w:t>13.04</w:t>
+              <w:t>12.88</w:t>
             </w:r>
           </w:p>
         </w:tc>
@@ -17637,7 +17709,7 @@
               <w:rPr>
                 <w:sz w:val="14"/>
               </w:rPr>
-              <w:t>92.6</w:t>
+              <w:t>92.3</w:t>
             </w:r>
           </w:p>
         </w:tc>
@@ -18462,7 +18534,7 @@
     <w:p/>
     <w:p>
       <w:r>
-        <w:t>Building outdoor air 275 L/s; exhaust 225 L/s (net +50 L/s). ASHRAE 62.2 whole-house cross-check: 65 L/s - design OA exceeds it.</w:t>
+        <w:t>Building outdoor air 271 L/s; exhaust 225 L/s (net +46 L/s). ASHRAE 62.2 whole-house cross-check: 64 L/s - design OA exceeds it.</w:t>
       </w:r>
     </w:p>
     <w:p>
@@ -18871,7 +18943,7 @@
               <w:rPr>
                 <w:sz w:val="13"/>
               </w:rPr>
-              <w:t>2.54</w:t>
+              <w:t>2.95</w:t>
             </w:r>
           </w:p>
         </w:tc>
@@ -18899,7 +18971,7 @@
               <w:rPr>
                 <w:sz w:val="13"/>
               </w:rPr>
-              <w:t>2.9</w:t>
+              <w:t>3.31</w:t>
             </w:r>
           </w:p>
         </w:tc>
@@ -18927,7 +18999,7 @@
               <w:rPr>
                 <w:sz w:val="13"/>
               </w:rPr>
-              <w:t>3.19</w:t>
+              <w:t>3.64</w:t>
             </w:r>
           </w:p>
         </w:tc>
@@ -18941,7 +19013,7 @@
               <w:rPr>
                 <w:sz w:val="13"/>
               </w:rPr>
-              <w:t>2.46</w:t>
+              <w:t>3.14</w:t>
             </w:r>
           </w:p>
         </w:tc>
@@ -18955,7 +19027,7 @@
               <w:rPr>
                 <w:sz w:val="13"/>
               </w:rPr>
-              <w:t>149 L/s</w:t>
+              <w:t>198 L/s</w:t>
             </w:r>
           </w:p>
         </w:tc>
@@ -19125,7 +19197,7 @@
               <w:rPr>
                 <w:sz w:val="13"/>
               </w:rPr>
-              <w:t>0.67</w:t>
+              <w:t>0.6</w:t>
             </w:r>
           </w:p>
         </w:tc>
@@ -19153,7 +19225,7 @@
               <w:rPr>
                 <w:sz w:val="13"/>
               </w:rPr>
-              <w:t>0.86</w:t>
+              <w:t>0.8</w:t>
             </w:r>
           </w:p>
         </w:tc>
@@ -19181,7 +19253,7 @@
               <w:rPr>
                 <w:sz w:val="13"/>
               </w:rPr>
-              <w:t>0.95</w:t>
+              <w:t>0.88</w:t>
             </w:r>
           </w:p>
         </w:tc>
@@ -19195,7 +19267,7 @@
               <w:rPr>
                 <w:sz w:val="13"/>
               </w:rPr>
-              <w:t>0.92</w:t>
+              <w:t>0.85</w:t>
             </w:r>
           </w:p>
         </w:tc>
@@ -19209,7 +19281,7 @@
               <w:rPr>
                 <w:sz w:val="13"/>
               </w:rPr>
-              <w:t>57 L/s</w:t>
+              <w:t>46 L/s</w:t>
             </w:r>
           </w:p>
         </w:tc>
@@ -19307,7 +19379,7 @@
               <w:rPr>
                 <w:sz w:val="13"/>
               </w:rPr>
-              <w:t>2.9 / 0.47</w:t>
+              <w:t>2.9 / 0.48</w:t>
             </w:r>
           </w:p>
         </w:tc>
@@ -19379,7 +19451,7 @@
               <w:rPr>
                 <w:sz w:val="13"/>
               </w:rPr>
-              <w:t>2.98</w:t>
+              <w:t>2.86</w:t>
             </w:r>
           </w:p>
         </w:tc>
@@ -19393,7 +19465,7 @@
               <w:rPr>
                 <w:sz w:val="13"/>
               </w:rPr>
-              <w:t>1.16</w:t>
+              <w:t>1.08</w:t>
             </w:r>
           </w:p>
         </w:tc>
@@ -19407,7 +19479,7 @@
               <w:rPr>
                 <w:sz w:val="13"/>
               </w:rPr>
-              <w:t>4.14</w:t>
+              <w:t>3.94</w:t>
             </w:r>
           </w:p>
         </w:tc>
@@ -19435,7 +19507,7 @@
               <w:rPr>
                 <w:sz w:val="13"/>
               </w:rPr>
-              <w:t>4.55</w:t>
+              <w:t>4.33</w:t>
             </w:r>
           </w:p>
         </w:tc>
@@ -19449,7 +19521,7 @@
               <w:rPr>
                 <w:sz w:val="13"/>
               </w:rPr>
-              <w:t>3.96</w:t>
+              <w:t>3.79</w:t>
             </w:r>
           </w:p>
         </w:tc>
@@ -19463,7 +19535,7 @@
               <w:rPr>
                 <w:sz w:val="13"/>
               </w:rPr>
-              <w:t>199 L/s</w:t>
+              <w:t>193 L/s</w:t>
             </w:r>
           </w:p>
         </w:tc>
@@ -19533,7 +19605,7 @@
               <w:rPr>
                 <w:sz w:val="13"/>
               </w:rPr>
-              <w:t>13%</w:t>
+              <w:t>12%</w:t>
             </w:r>
           </w:p>
         </w:tc>
@@ -19561,7 +19633,7 @@
               <w:rPr>
                 <w:sz w:val="13"/>
               </w:rPr>
-              <w:t>7.6 / 1.78</w:t>
+              <w:t>7.6 / 1.72</w:t>
             </w:r>
           </w:p>
         </w:tc>
@@ -19633,7 +19705,7 @@
               <w:rPr>
                 <w:sz w:val="13"/>
               </w:rPr>
-              <w:t>5.67</w:t>
+              <w:t>5.66</w:t>
             </w:r>
           </w:p>
         </w:tc>
@@ -19647,7 +19719,7 @@
               <w:rPr>
                 <w:sz w:val="13"/>
               </w:rPr>
-              <w:t>2.58</w:t>
+              <w:t>2.57</w:t>
             </w:r>
           </w:p>
         </w:tc>
@@ -19661,7 +19733,7 @@
               <w:rPr>
                 <w:sz w:val="13"/>
               </w:rPr>
-              <w:t>8.25</w:t>
+              <w:t>8.23</w:t>
             </w:r>
           </w:p>
         </w:tc>
@@ -19689,7 +19761,7 @@
               <w:rPr>
                 <w:sz w:val="13"/>
               </w:rPr>
-              <w:t>9.07</w:t>
+              <w:t>9.05</w:t>
             </w:r>
           </w:p>
         </w:tc>
@@ -19703,7 +19775,7 @@
               <w:rPr>
                 <w:sz w:val="13"/>
               </w:rPr>
-              <w:t>8.18</w:t>
+              <w:t>8.16</w:t>
             </w:r>
           </w:p>
         </w:tc>
@@ -19717,7 +19789,7 @@
               <w:rPr>
                 <w:sz w:val="13"/>
               </w:rPr>
-              <w:t>432 L/s</w:t>
+              <w:t>431 L/s</w:t>
             </w:r>
           </w:p>
         </w:tc>
@@ -19815,7 +19887,7 @@
               <w:rPr>
                 <w:sz w:val="13"/>
               </w:rPr>
-              <w:t>15.0 / 3.93</w:t>
+              <w:t>15.0 / 3.92</w:t>
             </w:r>
           </w:p>
         </w:tc>
@@ -19887,7 +19959,7 @@
               <w:rPr>
                 <w:sz w:val="13"/>
               </w:rPr>
-              <w:t>2.01</w:t>
+              <w:t>2.0</w:t>
             </w:r>
           </w:p>
         </w:tc>
@@ -19915,7 +19987,7 @@
               <w:rPr>
                 <w:sz w:val="13"/>
               </w:rPr>
-              <w:t>2.47</w:t>
+              <w:t>2.46</w:t>
             </w:r>
           </w:p>
         </w:tc>
@@ -19943,7 +20015,7 @@
               <w:rPr>
                 <w:sz w:val="13"/>
               </w:rPr>
-              <w:t>2.72</w:t>
+              <w:t>2.7</w:t>
             </w:r>
           </w:p>
         </w:tc>
@@ -19957,7 +20029,7 @@
               <w:rPr>
                 <w:sz w:val="13"/>
               </w:rPr>
-              <w:t>2.66</w:t>
+              <w:t>2.65</w:t>
             </w:r>
           </w:p>
         </w:tc>
@@ -19971,7 +20043,7 @@
               <w:rPr>
                 <w:sz w:val="13"/>
               </w:rPr>
-              <w:t>181 L/s</w:t>
+              <w:t>180 L/s</w:t>
             </w:r>
           </w:p>
         </w:tc>
@@ -19985,7 +20057,7 @@
               <w:rPr>
                 <w:sz w:val="13"/>
               </w:rPr>
-              <w:t>IU-FF-01 DS-24</w:t>
+              <w:t>IU-FF-01 DS-18</w:t>
             </w:r>
           </w:p>
         </w:tc>
@@ -19999,7 +20071,7 @@
               <w:rPr>
                 <w:sz w:val="13"/>
               </w:rPr>
-              <w:t>6.16</w:t>
+              <w:t>4.66</w:t>
             </w:r>
           </w:p>
         </w:tc>
@@ -20013,7 +20085,7 @@
               <w:rPr>
                 <w:sz w:val="13"/>
               </w:rPr>
-              <w:t>4.62</w:t>
+              <w:t>3.5</w:t>
             </w:r>
           </w:p>
         </w:tc>
@@ -20027,7 +20099,7 @@
               <w:rPr>
                 <w:sz w:val="13"/>
               </w:rPr>
-              <w:t>380 L/s</w:t>
+              <w:t>300 L/s</w:t>
             </w:r>
           </w:p>
         </w:tc>
@@ -20041,7 +20113,7 @@
               <w:rPr>
                 <w:sz w:val="13"/>
               </w:rPr>
-              <w:t>5%</w:t>
+              <w:t>7%</w:t>
             </w:r>
           </w:p>
         </w:tc>
@@ -20055,7 +20127,7 @@
               <w:rPr>
                 <w:sz w:val="13"/>
               </w:rPr>
-              <w:t>2.19</w:t>
+              <w:t>1.66</w:t>
             </w:r>
           </w:p>
         </w:tc>
@@ -20069,7 +20141,7 @@
               <w:rPr>
                 <w:sz w:val="13"/>
               </w:rPr>
-              <w:t>7.6 / 1.18</w:t>
+              <w:t>5.8 / 1.18</w:t>
             </w:r>
           </w:p>
         </w:tc>
@@ -20141,7 +20213,7 @@
               <w:rPr>
                 <w:sz w:val="13"/>
               </w:rPr>
-              <w:t>6.47</w:t>
+              <w:t>6.54</w:t>
             </w:r>
           </w:p>
         </w:tc>
@@ -20169,7 +20241,7 @@
               <w:rPr>
                 <w:sz w:val="13"/>
               </w:rPr>
-              <w:t>8.72</w:t>
+              <w:t>8.78</w:t>
             </w:r>
           </w:p>
         </w:tc>
@@ -20197,7 +20269,7 @@
               <w:rPr>
                 <w:sz w:val="13"/>
               </w:rPr>
-              <w:t>9.59</w:t>
+              <w:t>9.65</w:t>
             </w:r>
           </w:p>
         </w:tc>
@@ -20211,7 +20283,7 @@
               <w:rPr>
                 <w:sz w:val="13"/>
               </w:rPr>
-              <w:t>8.98</w:t>
+              <w:t>9.04</w:t>
             </w:r>
           </w:p>
         </w:tc>
@@ -20225,7 +20297,7 @@
               <w:rPr>
                 <w:sz w:val="13"/>
               </w:rPr>
-              <w:t>520 L/s</w:t>
+              <w:t>522 L/s</w:t>
             </w:r>
           </w:p>
         </w:tc>
@@ -20323,7 +20395,7 @@
               <w:rPr>
                 <w:sz w:val="13"/>
               </w:rPr>
-              <w:t>15.0 / 3.69</w:t>
+              <w:t>15.0 / 3.75</w:t>
             </w:r>
           </w:p>
         </w:tc>
@@ -20884,7 +20956,7 @@
               <w:rPr>
                 <w:sz w:val="15"/>
               </w:rPr>
-              <w:t>DS-O-24</w:t>
+              <w:t>DS-O-18</w:t>
             </w:r>
           </w:p>
         </w:tc>
@@ -20926,7 +20998,7 @@
               <w:rPr>
                 <w:sz w:val="15"/>
               </w:rPr>
-              <w:t>7.0 kW</w:t>
+              <w:t>5.3 kW</w:t>
             </w:r>
           </w:p>
         </w:tc>
@@ -20940,7 +21012,7 @@
               <w:rPr>
                 <w:sz w:val="15"/>
               </w:rPr>
-              <w:t>2.19</w:t>
+              <w:t>1.66</w:t>
             </w:r>
           </w:p>
         </w:tc>
@@ -21314,7 +21386,7 @@
               <w:rPr>
                 <w:sz w:val="13"/>
               </w:rPr>
-              <w:t>main</w:t>
+              <w:t>riser</w:t>
             </w:r>
           </w:p>
         </w:tc>
@@ -21412,7 +21484,7 @@
               <w:rPr>
                 <w:sz w:val="13"/>
               </w:rPr>
-              <w:t>4.72</w:t>
+              <w:t>4.66</w:t>
             </w:r>
           </w:p>
         </w:tc>
@@ -21426,7 +21498,7 @@
               <w:rPr>
                 <w:sz w:val="13"/>
               </w:rPr>
-              <w:t>5.1 Pa</w:t>
+              <w:t>5.0 Pa</w:t>
             </w:r>
           </w:p>
         </w:tc>
@@ -21568,7 +21640,7 @@
               <w:rPr>
                 <w:sz w:val="13"/>
               </w:rPr>
-              <w:t>1.47</w:t>
+              <w:t>1.44</w:t>
             </w:r>
           </w:p>
         </w:tc>
@@ -21724,7 +21796,7 @@
               <w:rPr>
                 <w:sz w:val="13"/>
               </w:rPr>
-              <w:t>1.47</w:t>
+              <w:t>1.44</w:t>
             </w:r>
           </w:p>
         </w:tc>
@@ -21966,7 +22038,7 @@
               <w:rPr>
                 <w:sz w:val="13"/>
               </w:rPr>
-              <w:t>48 L/s</w:t>
+              <w:t>45 L/s</w:t>
             </w:r>
           </w:p>
         </w:tc>
@@ -22008,7 +22080,7 @@
               <w:rPr>
                 <w:sz w:val="13"/>
               </w:rPr>
-              <w:t>2.71 m/s</w:t>
+              <w:t>2.53 m/s</w:t>
             </w:r>
           </w:p>
         </w:tc>
@@ -22022,7 +22094,7 @@
               <w:rPr>
                 <w:sz w:val="13"/>
               </w:rPr>
-              <w:t>0.76 Pa/m</w:t>
+              <w:t>0.68 Pa/m</w:t>
             </w:r>
           </w:p>
         </w:tc>
@@ -22050,7 +22122,7 @@
               <w:rPr>
                 <w:sz w:val="13"/>
               </w:rPr>
-              <w:t>2.7 Pa</w:t>
+              <w:t>2.4 Pa</w:t>
             </w:r>
           </w:p>
         </w:tc>
@@ -22334,7 +22406,7 @@
               <w:rPr>
                 <w:sz w:val="13"/>
               </w:rPr>
-              <w:t>403 L/s</w:t>
+              <w:t>402 L/s</w:t>
             </w:r>
           </w:p>
         </w:tc>
@@ -22348,7 +22420,7 @@
               <w:rPr>
                 <w:sz w:val="13"/>
               </w:rPr>
-              <w:t>350x300</w:t>
+              <w:t>300x300</w:t>
             </w:r>
           </w:p>
         </w:tc>
@@ -22362,7 +22434,7 @@
               <w:rPr>
                 <w:sz w:val="13"/>
               </w:rPr>
-              <w:t>354</w:t>
+              <w:t>328</w:t>
             </w:r>
           </w:p>
         </w:tc>
@@ -22376,7 +22448,7 @@
               <w:rPr>
                 <w:sz w:val="13"/>
               </w:rPr>
-              <w:t>3.84 m/s</w:t>
+              <w:t>4.47 m/s</w:t>
             </w:r>
           </w:p>
         </w:tc>
@@ -22390,7 +22462,7 @@
               <w:rPr>
                 <w:sz w:val="13"/>
               </w:rPr>
-              <w:t>0.55 Pa/m</w:t>
+              <w:t>0.80 Pa/m</w:t>
             </w:r>
           </w:p>
         </w:tc>
@@ -22418,7 +22490,7 @@
               <w:rPr>
                 <w:sz w:val="13"/>
               </w:rPr>
-              <w:t>3.0 Pa</w:t>
+              <w:t>4.3 Pa</w:t>
             </w:r>
           </w:p>
         </w:tc>
@@ -22432,7 +22504,7 @@
               <w:rPr>
                 <w:sz w:val="13"/>
               </w:rPr>
-              <w:t>24 ga (0.70 mm)</w:t>
+              <w:t>26 ga (0.55 mm)</w:t>
             </w:r>
           </w:p>
         </w:tc>
@@ -22490,7 +22562,7 @@
               <w:rPr>
                 <w:sz w:val="13"/>
               </w:rPr>
-              <w:t>340 L/s</w:t>
+              <w:t>295 L/s</w:t>
             </w:r>
           </w:p>
         </w:tc>
@@ -22504,7 +22576,7 @@
               <w:rPr>
                 <w:sz w:val="13"/>
               </w:rPr>
-              <w:t>300x300</w:t>
+              <w:t>300x250</w:t>
             </w:r>
           </w:p>
         </w:tc>
@@ -22518,7 +22590,7 @@
               <w:rPr>
                 <w:sz w:val="13"/>
               </w:rPr>
-              <w:t>328</w:t>
+              <w:t>299</w:t>
             </w:r>
           </w:p>
         </w:tc>
@@ -22532,7 +22604,7 @@
               <w:rPr>
                 <w:sz w:val="13"/>
               </w:rPr>
-              <w:t>3.78 m/s</w:t>
+              <w:t>3.94 m/s</w:t>
             </w:r>
           </w:p>
         </w:tc>
@@ -22546,7 +22618,7 @@
               <w:rPr>
                 <w:sz w:val="13"/>
               </w:rPr>
-              <w:t>0.59 Pa/m</w:t>
+              <w:t>0.71 Pa/m</w:t>
             </w:r>
           </w:p>
         </w:tc>
@@ -22560,7 +22632,7 @@
               <w:rPr>
                 <w:sz w:val="13"/>
               </w:rPr>
-              <w:t>0.1</w:t>
+              <w:t>1.0</w:t>
             </w:r>
           </w:p>
         </w:tc>
@@ -22574,7 +22646,7 @@
               <w:rPr>
                 <w:sz w:val="13"/>
               </w:rPr>
-              <w:t>0.1 Pa</w:t>
+              <w:t>1.1 Pa</w:t>
             </w:r>
           </w:p>
         </w:tc>
@@ -22646,7 +22718,7 @@
               <w:rPr>
                 <w:sz w:val="13"/>
               </w:rPr>
-              <w:t>295 L/s</w:t>
+              <w:t>52 L/s</w:t>
             </w:r>
           </w:p>
         </w:tc>
@@ -22660,7 +22732,7 @@
               <w:rPr>
                 <w:sz w:val="13"/>
               </w:rPr>
-              <w:t>300x250</w:t>
+              <w:t>150x150</w:t>
             </w:r>
           </w:p>
         </w:tc>
@@ -22674,7 +22746,7 @@
               <w:rPr>
                 <w:sz w:val="13"/>
               </w:rPr>
-              <w:t>299</w:t>
+              <w:t>164</w:t>
             </w:r>
           </w:p>
         </w:tc>
@@ -22688,7 +22760,7 @@
               <w:rPr>
                 <w:sz w:val="13"/>
               </w:rPr>
-              <w:t>3.93 m/s</w:t>
+              <w:t>2.32 m/s</w:t>
             </w:r>
           </w:p>
         </w:tc>
@@ -22702,7 +22774,7 @@
               <w:rPr>
                 <w:sz w:val="13"/>
               </w:rPr>
-              <w:t>0.71 Pa/m</w:t>
+              <w:t>0.58 Pa/m</w:t>
             </w:r>
           </w:p>
         </w:tc>
@@ -22716,7 +22788,7 @@
               <w:rPr>
                 <w:sz w:val="13"/>
               </w:rPr>
-              <w:t>1.0</w:t>
+              <w:t>2.38</w:t>
             </w:r>
           </w:p>
         </w:tc>
@@ -22730,7 +22802,7 @@
               <w:rPr>
                 <w:sz w:val="13"/>
               </w:rPr>
-              <w:t>1.1 Pa</w:t>
+              <w:t>2.1 Pa</w:t>
             </w:r>
           </w:p>
         </w:tc>
@@ -22774,7 +22846,7 @@
               <w:rPr>
                 <w:sz w:val="13"/>
               </w:rPr>
-              <w:t>main</w:t>
+              <w:t>branch</w:t>
             </w:r>
           </w:p>
         </w:tc>
@@ -22788,7 +22860,7 @@
               <w:rPr>
                 <w:sz w:val="13"/>
               </w:rPr>
-              <w:t>-</w:t>
+              <w:t>GF-05</w:t>
             </w:r>
           </w:p>
         </w:tc>
@@ -22802,7 +22874,7 @@
               <w:rPr>
                 <w:sz w:val="13"/>
               </w:rPr>
-              <w:t>52 L/s</w:t>
+              <w:t>243 L/s</w:t>
             </w:r>
           </w:p>
         </w:tc>
@@ -22816,7 +22888,7 @@
               <w:rPr>
                 <w:sz w:val="13"/>
               </w:rPr>
-              <w:t>150x150</w:t>
+              <w:t>300x300</w:t>
             </w:r>
           </w:p>
         </w:tc>
@@ -22830,7 +22902,7 @@
               <w:rPr>
                 <w:sz w:val="13"/>
               </w:rPr>
-              <w:t>164</w:t>
+              <w:t>328</w:t>
             </w:r>
           </w:p>
         </w:tc>
@@ -22844,7 +22916,7 @@
               <w:rPr>
                 <w:sz w:val="13"/>
               </w:rPr>
-              <w:t>2.32 m/s</w:t>
+              <w:t>2.70 m/s</w:t>
             </w:r>
           </w:p>
         </w:tc>
@@ -22858,7 +22930,7 @@
               <w:rPr>
                 <w:sz w:val="13"/>
               </w:rPr>
-              <w:t>0.58 Pa/m</w:t>
+              <w:t>0.32 Pa/m</w:t>
             </w:r>
           </w:p>
         </w:tc>
@@ -22872,7 +22944,7 @@
               <w:rPr>
                 <w:sz w:val="13"/>
               </w:rPr>
-              <w:t>2.38</w:t>
+              <w:t>3.92</w:t>
             </w:r>
           </w:p>
         </w:tc>
@@ -22886,7 +22958,7 @@
               <w:rPr>
                 <w:sz w:val="13"/>
               </w:rPr>
-              <w:t>2.1 Pa</w:t>
+              <w:t>1.9 Pa</w:t>
             </w:r>
           </w:p>
         </w:tc>
@@ -22930,7 +23002,7 @@
               <w:rPr>
                 <w:sz w:val="13"/>
               </w:rPr>
-              <w:t>branch</w:t>
+              <w:t>runout</w:t>
             </w:r>
           </w:p>
         </w:tc>
@@ -22958,7 +23030,7 @@
               <w:rPr>
                 <w:sz w:val="13"/>
               </w:rPr>
-              <w:t>243 L/s</w:t>
+              <w:t>122 L/s</w:t>
             </w:r>
           </w:p>
         </w:tc>
@@ -22972,7 +23044,7 @@
               <w:rPr>
                 <w:sz w:val="13"/>
               </w:rPr>
-              <w:t>300x300</w:t>
+              <w:t>Ø250 flex</w:t>
             </w:r>
           </w:p>
         </w:tc>
@@ -22986,7 +23058,7 @@
               <w:rPr>
                 <w:sz w:val="13"/>
               </w:rPr>
-              <w:t>328</w:t>
+              <w:t>250</w:t>
             </w:r>
           </w:p>
         </w:tc>
@@ -23000,7 +23072,7 @@
               <w:rPr>
                 <w:sz w:val="13"/>
               </w:rPr>
-              <w:t>2.70 m/s</w:t>
+              <w:t>2.48 m/s</w:t>
             </w:r>
           </w:p>
         </w:tc>
@@ -23014,7 +23086,7 @@
               <w:rPr>
                 <w:sz w:val="13"/>
               </w:rPr>
-              <w:t>0.32 Pa/m</w:t>
+              <w:t>0.34 Pa/m</w:t>
             </w:r>
           </w:p>
         </w:tc>
@@ -23028,7 +23100,7 @@
               <w:rPr>
                 <w:sz w:val="13"/>
               </w:rPr>
-              <w:t>3.97</w:t>
+              <w:t>1.19</w:t>
             </w:r>
           </w:p>
         </w:tc>
@@ -23042,7 +23114,7 @@
               <w:rPr>
                 <w:sz w:val="13"/>
               </w:rPr>
-              <w:t>1.9 Pa</w:t>
+              <w:t>0.6 Pa</w:t>
             </w:r>
           </w:p>
         </w:tc>
@@ -23056,7 +23128,7 @@
               <w:rPr>
                 <w:sz w:val="13"/>
               </w:rPr>
-              <w:t>26 ga (0.55 mm)</w:t>
+              <w:t>flex</w:t>
             </w:r>
           </w:p>
         </w:tc>
@@ -23114,7 +23186,7 @@
               <w:rPr>
                 <w:sz w:val="13"/>
               </w:rPr>
-              <w:t>121 L/s</w:t>
+              <w:t>122 L/s</w:t>
             </w:r>
           </w:p>
         </w:tc>
@@ -23156,7 +23228,7 @@
               <w:rPr>
                 <w:sz w:val="13"/>
               </w:rPr>
-              <w:t>2.47 m/s</w:t>
+              <w:t>2.48 m/s</w:t>
             </w:r>
           </w:p>
         </w:tc>
@@ -23184,7 +23256,7 @@
               <w:rPr>
                 <w:sz w:val="13"/>
               </w:rPr>
-              <w:t>1.22</w:t>
+              <w:t>1.19</w:t>
             </w:r>
           </w:p>
         </w:tc>
@@ -23242,7 +23314,7 @@
               <w:rPr>
                 <w:sz w:val="13"/>
               </w:rPr>
-              <w:t>runout</w:t>
+              <w:t>branch</w:t>
             </w:r>
           </w:p>
         </w:tc>
@@ -23256,7 +23328,7 @@
               <w:rPr>
                 <w:sz w:val="13"/>
               </w:rPr>
-              <w:t>GF-05</w:t>
+              <w:t>GF-02</w:t>
             </w:r>
           </w:p>
         </w:tc>
@@ -23270,7 +23342,7 @@
               <w:rPr>
                 <w:sz w:val="13"/>
               </w:rPr>
-              <w:t>121 L/s</w:t>
+              <w:t>63 L/s</w:t>
             </w:r>
           </w:p>
         </w:tc>
@@ -23284,7 +23356,7 @@
               <w:rPr>
                 <w:sz w:val="13"/>
               </w:rPr>
-              <w:t>Ø250 flex</w:t>
+              <w:t>200x150</w:t>
             </w:r>
           </w:p>
         </w:tc>
@@ -23298,7 +23370,7 @@
               <w:rPr>
                 <w:sz w:val="13"/>
               </w:rPr>
-              <w:t>250</w:t>
+              <w:t>189</w:t>
             </w:r>
           </w:p>
         </w:tc>
@@ -23312,7 +23384,7 @@
               <w:rPr>
                 <w:sz w:val="13"/>
               </w:rPr>
-              <w:t>2.47 m/s</w:t>
+              <w:t>2.09 m/s</w:t>
             </w:r>
           </w:p>
         </w:tc>
@@ -23326,7 +23398,7 @@
               <w:rPr>
                 <w:sz w:val="13"/>
               </w:rPr>
-              <w:t>0.34 Pa/m</w:t>
+              <w:t>0.41 Pa/m</w:t>
             </w:r>
           </w:p>
         </w:tc>
@@ -23340,7 +23412,7 @@
               <w:rPr>
                 <w:sz w:val="13"/>
               </w:rPr>
-              <w:t>1.22</w:t>
+              <w:t>1.25</w:t>
             </w:r>
           </w:p>
         </w:tc>
@@ -23354,7 +23426,7 @@
               <w:rPr>
                 <w:sz w:val="13"/>
               </w:rPr>
-              <w:t>0.6 Pa</w:t>
+              <w:t>0.8 Pa</w:t>
             </w:r>
           </w:p>
         </w:tc>
@@ -23368,7 +23440,7 @@
               <w:rPr>
                 <w:sz w:val="13"/>
               </w:rPr>
-              <w:t>flex</w:t>
+              <w:t>26 ga (0.55 mm)</w:t>
             </w:r>
           </w:p>
         </w:tc>
@@ -23398,7 +23470,7 @@
               <w:rPr>
                 <w:sz w:val="13"/>
               </w:rPr>
-              <w:t>branch</w:t>
+              <w:t>runout</w:t>
             </w:r>
           </w:p>
         </w:tc>
@@ -23426,7 +23498,7 @@
               <w:rPr>
                 <w:sz w:val="13"/>
               </w:rPr>
-              <w:t>62 L/s</w:t>
+              <w:t>31 L/s</w:t>
             </w:r>
           </w:p>
         </w:tc>
@@ -23440,7 +23512,7 @@
               <w:rPr>
                 <w:sz w:val="13"/>
               </w:rPr>
-              <w:t>200x150</w:t>
+              <w:t>Ø150 flex</w:t>
             </w:r>
           </w:p>
         </w:tc>
@@ -23454,7 +23526,7 @@
               <w:rPr>
                 <w:sz w:val="13"/>
               </w:rPr>
-              <w:t>189</w:t>
+              <w:t>150</w:t>
             </w:r>
           </w:p>
         </w:tc>
@@ -23468,7 +23540,7 @@
               <w:rPr>
                 <w:sz w:val="13"/>
               </w:rPr>
-              <w:t>2.08 m/s</w:t>
+              <w:t>1.77 m/s</w:t>
             </w:r>
           </w:p>
         </w:tc>
@@ -23482,7 +23554,7 @@
               <w:rPr>
                 <w:sz w:val="13"/>
               </w:rPr>
-              <w:t>0.40 Pa/m</w:t>
+              <w:t>0.36 Pa/m</w:t>
             </w:r>
           </w:p>
         </w:tc>
@@ -23496,7 +23568,7 @@
               <w:rPr>
                 <w:sz w:val="13"/>
               </w:rPr>
-              <w:t>1.25</w:t>
+              <w:t>1.22</w:t>
             </w:r>
           </w:p>
         </w:tc>
@@ -23510,7 +23582,7 @@
               <w:rPr>
                 <w:sz w:val="13"/>
               </w:rPr>
-              <w:t>0.8 Pa</w:t>
+              <w:t>0.7 Pa</w:t>
             </w:r>
           </w:p>
         </w:tc>
@@ -23524,7 +23596,7 @@
               <w:rPr>
                 <w:sz w:val="13"/>
               </w:rPr>
-              <w:t>26 ga (0.55 mm)</w:t>
+              <w:t>flex</w:t>
             </w:r>
           </w:p>
         </w:tc>
@@ -23638,7 +23710,7 @@
               <w:rPr>
                 <w:sz w:val="13"/>
               </w:rPr>
-              <w:t>0.35 Pa/m</w:t>
+              <w:t>0.36 Pa/m</w:t>
             </w:r>
           </w:p>
         </w:tc>
@@ -23666,7 +23738,7 @@
               <w:rPr>
                 <w:sz w:val="13"/>
               </w:rPr>
-              <w:t>0.6 Pa</w:t>
+              <w:t>0.7 Pa</w:t>
             </w:r>
           </w:p>
         </w:tc>
@@ -23710,7 +23782,7 @@
               <w:rPr>
                 <w:sz w:val="13"/>
               </w:rPr>
-              <w:t>runout</w:t>
+              <w:t>branch</w:t>
             </w:r>
           </w:p>
         </w:tc>
@@ -23724,7 +23796,7 @@
               <w:rPr>
                 <w:sz w:val="13"/>
               </w:rPr>
-              <w:t>GF-02</w:t>
+              <w:t>GF-03</w:t>
             </w:r>
           </w:p>
         </w:tc>
@@ -23738,7 +23810,7 @@
               <w:rPr>
                 <w:sz w:val="13"/>
               </w:rPr>
-              <w:t>31 L/s</w:t>
+              <w:t>340 L/s</w:t>
             </w:r>
           </w:p>
         </w:tc>
@@ -23752,7 +23824,7 @@
               <w:rPr>
                 <w:sz w:val="13"/>
               </w:rPr>
-              <w:t>Ø150 flex</w:t>
+              <w:t>400x300</w:t>
             </w:r>
           </w:p>
         </w:tc>
@@ -23766,7 +23838,7 @@
               <w:rPr>
                 <w:sz w:val="13"/>
               </w:rPr>
-              <w:t>150</w:t>
+              <w:t>378</w:t>
             </w:r>
           </w:p>
         </w:tc>
@@ -23780,7 +23852,7 @@
               <w:rPr>
                 <w:sz w:val="13"/>
               </w:rPr>
-              <w:t>1.77 m/s</w:t>
+              <w:t>2.83 m/s</w:t>
             </w:r>
           </w:p>
         </w:tc>
@@ -23794,7 +23866,7 @@
               <w:rPr>
                 <w:sz w:val="13"/>
               </w:rPr>
-              <w:t>0.35 Pa/m</w:t>
+              <w:t>0.29 Pa/m</w:t>
             </w:r>
           </w:p>
         </w:tc>
@@ -23808,7 +23880,7 @@
               <w:rPr>
                 <w:sz w:val="13"/>
               </w:rPr>
-              <w:t>1.22</w:t>
+              <w:t>6.17</w:t>
             </w:r>
           </w:p>
         </w:tc>
@@ -23822,7 +23894,7 @@
               <w:rPr>
                 <w:sz w:val="13"/>
               </w:rPr>
-              <w:t>0.6 Pa</w:t>
+              <w:t>2.7 Pa</w:t>
             </w:r>
           </w:p>
         </w:tc>
@@ -23836,7 +23908,7 @@
               <w:rPr>
                 <w:sz w:val="13"/>
               </w:rPr>
-              <w:t>flex</w:t>
+              <w:t>24 ga (0.70 mm)</w:t>
             </w:r>
           </w:p>
         </w:tc>
@@ -23866,7 +23938,7 @@
               <w:rPr>
                 <w:sz w:val="13"/>
               </w:rPr>
-              <w:t>branch</w:t>
+              <w:t>runout</w:t>
             </w:r>
           </w:p>
         </w:tc>
@@ -23894,7 +23966,7 @@
               <w:rPr>
                 <w:sz w:val="13"/>
               </w:rPr>
-              <w:t>340 L/s</w:t>
+              <w:t>170 L/s</w:t>
             </w:r>
           </w:p>
         </w:tc>
@@ -23908,7 +23980,7 @@
               <w:rPr>
                 <w:sz w:val="13"/>
               </w:rPr>
-              <w:t>400x300</w:t>
+              <w:t>Ø300 round</w:t>
             </w:r>
           </w:p>
         </w:tc>
@@ -23922,7 +23994,7 @@
               <w:rPr>
                 <w:sz w:val="13"/>
               </w:rPr>
-              <w:t>378</w:t>
+              <w:t>300</w:t>
             </w:r>
           </w:p>
         </w:tc>
@@ -23936,7 +24008,7 @@
               <w:rPr>
                 <w:sz w:val="13"/>
               </w:rPr>
-              <w:t>2.84 m/s</w:t>
+              <w:t>2.40 m/s</w:t>
             </w:r>
           </w:p>
         </w:tc>
@@ -23950,7 +24022,7 @@
               <w:rPr>
                 <w:sz w:val="13"/>
               </w:rPr>
-              <w:t>0.30 Pa/m</w:t>
+              <w:t>0.26 Pa/m</w:t>
             </w:r>
           </w:p>
         </w:tc>
@@ -23964,7 +24036,7 @@
               <w:rPr>
                 <w:sz w:val="13"/>
               </w:rPr>
-              <w:t>6.22</w:t>
+              <w:t>1.57</w:t>
             </w:r>
           </w:p>
         </w:tc>
@@ -23978,7 +24050,7 @@
               <w:rPr>
                 <w:sz w:val="13"/>
               </w:rPr>
-              <w:t>2.8 Pa</w:t>
+              <w:t>0.6 Pa</w:t>
             </w:r>
           </w:p>
         </w:tc>
@@ -23992,7 +24064,7 @@
               <w:rPr>
                 <w:sz w:val="13"/>
               </w:rPr>
-              <w:t>24 ga (0.70 mm)</w:t>
+              <w:t>26 ga (0.55 mm)</w:t>
             </w:r>
           </w:p>
         </w:tc>
@@ -24092,7 +24164,7 @@
               <w:rPr>
                 <w:sz w:val="13"/>
               </w:rPr>
-              <w:t>2.41 m/s</w:t>
+              <w:t>2.40 m/s</w:t>
             </w:r>
           </w:p>
         </w:tc>
@@ -24120,7 +24192,7 @@
               <w:rPr>
                 <w:sz w:val="13"/>
               </w:rPr>
-              <w:t>1.59</w:t>
+              <w:t>1.57</w:t>
             </w:r>
           </w:p>
         </w:tc>
@@ -24178,7 +24250,7 @@
               <w:rPr>
                 <w:sz w:val="13"/>
               </w:rPr>
-              <w:t>runout</w:t>
+              <w:t>main</w:t>
             </w:r>
           </w:p>
         </w:tc>
@@ -24192,7 +24264,7 @@
               <w:rPr>
                 <w:sz w:val="13"/>
               </w:rPr>
-              <w:t>GF-03</w:t>
+              <w:t>-</w:t>
             </w:r>
           </w:p>
         </w:tc>
@@ -24206,7 +24278,7 @@
               <w:rPr>
                 <w:sz w:val="13"/>
               </w:rPr>
-              <w:t>170 L/s</w:t>
+              <w:t>750 L/s</w:t>
             </w:r>
           </w:p>
         </w:tc>
@@ -24220,7 +24292,7 @@
               <w:rPr>
                 <w:sz w:val="13"/>
               </w:rPr>
-              <w:t>Ø300 round</w:t>
+              <w:t>850x300</w:t>
             </w:r>
           </w:p>
         </w:tc>
@@ -24234,7 +24306,7 @@
               <w:rPr>
                 <w:sz w:val="13"/>
               </w:rPr>
-              <w:t>300</w:t>
+              <w:t>534</w:t>
             </w:r>
           </w:p>
         </w:tc>
@@ -24248,7 +24320,7 @@
               <w:rPr>
                 <w:sz w:val="13"/>
               </w:rPr>
-              <w:t>2.41 m/s</w:t>
+              <w:t>2.94 m/s</w:t>
             </w:r>
           </w:p>
         </w:tc>
@@ -24262,7 +24334,7 @@
               <w:rPr>
                 <w:sz w:val="13"/>
               </w:rPr>
-              <w:t>0.26 Pa/m</w:t>
+              <w:t>0.23 Pa/m</w:t>
             </w:r>
           </w:p>
         </w:tc>
@@ -24276,7 +24348,7 @@
               <w:rPr>
                 <w:sz w:val="13"/>
               </w:rPr>
-              <w:t>1.59</w:t>
+              <w:t>1.2</w:t>
             </w:r>
           </w:p>
         </w:tc>
@@ -24290,7 +24362,7 @@
               <w:rPr>
                 <w:sz w:val="13"/>
               </w:rPr>
-              <w:t>0.6 Pa</w:t>
+              <w:t>0.4 Pa</w:t>
             </w:r>
           </w:p>
         </w:tc>
@@ -24304,7 +24376,7 @@
               <w:rPr>
                 <w:sz w:val="13"/>
               </w:rPr>
-              <w:t>26 ga (0.55 mm)</w:t>
+              <w:t>22 ga (0.85 mm)</w:t>
             </w:r>
           </w:p>
         </w:tc>
@@ -24362,7 +24434,7 @@
               <w:rPr>
                 <w:sz w:val="13"/>
               </w:rPr>
-              <w:t>750 L/s</w:t>
+              <w:t>106 L/s</w:t>
             </w:r>
           </w:p>
         </w:tc>
@@ -24376,7 +24448,7 @@
               <w:rPr>
                 <w:sz w:val="13"/>
               </w:rPr>
-              <w:t>850x300</w:t>
+              <w:t>Ø200 round</w:t>
             </w:r>
           </w:p>
         </w:tc>
@@ -24390,7 +24462,7 @@
               <w:rPr>
                 <w:sz w:val="13"/>
               </w:rPr>
-              <w:t>534</w:t>
+              <w:t>200</w:t>
             </w:r>
           </w:p>
         </w:tc>
@@ -24404,7 +24476,7 @@
               <w:rPr>
                 <w:sz w:val="13"/>
               </w:rPr>
-              <w:t>2.94 m/s</w:t>
+              <w:t>3.38 m/s</w:t>
             </w:r>
           </w:p>
         </w:tc>
@@ -24418,7 +24490,7 @@
               <w:rPr>
                 <w:sz w:val="13"/>
               </w:rPr>
-              <w:t>0.23 Pa/m</w:t>
+              <w:t>0.79 Pa/m</w:t>
             </w:r>
           </w:p>
         </w:tc>
@@ -24432,7 +24504,7 @@
               <w:rPr>
                 <w:sz w:val="13"/>
               </w:rPr>
-              <w:t>1.2</w:t>
+              <w:t>6.09</w:t>
             </w:r>
           </w:p>
         </w:tc>
@@ -24446,163 +24518,7 @@
               <w:rPr>
                 <w:sz w:val="13"/>
               </w:rPr>
-              <w:t>0.4 Pa</w:t>
-            </w:r>
-          </w:p>
-        </w:tc>
-        <w:tc>
-          <w:tcPr>
-            <w:tcW w:type="dxa" w:w="1255"/>
-          </w:tcPr>
-          <w:p>
-            <w:r/>
-            <w:r>
-              <w:rPr>
-                <w:sz w:val="13"/>
-              </w:rPr>
-              <w:t>22 ga (0.85 mm)</w:t>
-            </w:r>
-          </w:p>
-        </w:tc>
-      </w:tr>
-      <w:tr>
-        <w:tc>
-          <w:tcPr>
-            <w:tcW w:type="dxa" w:w="1255"/>
-          </w:tcPr>
-          <w:p>
-            <w:r/>
-            <w:r>
-              <w:rPr>
-                <w:sz w:val="13"/>
-              </w:rPr>
-              <w:t>D-GF-020</w:t>
-            </w:r>
-          </w:p>
-        </w:tc>
-        <w:tc>
-          <w:tcPr>
-            <w:tcW w:type="dxa" w:w="1255"/>
-          </w:tcPr>
-          <w:p>
-            <w:r/>
-            <w:r>
-              <w:rPr>
-                <w:sz w:val="13"/>
-              </w:rPr>
-              <w:t>main</w:t>
-            </w:r>
-          </w:p>
-        </w:tc>
-        <w:tc>
-          <w:tcPr>
-            <w:tcW w:type="dxa" w:w="1255"/>
-          </w:tcPr>
-          <w:p>
-            <w:r/>
-            <w:r>
-              <w:rPr>
-                <w:sz w:val="13"/>
-              </w:rPr>
-              <w:t>-</w:t>
-            </w:r>
-          </w:p>
-        </w:tc>
-        <w:tc>
-          <w:tcPr>
-            <w:tcW w:type="dxa" w:w="1255"/>
-          </w:tcPr>
-          <w:p>
-            <w:r/>
-            <w:r>
-              <w:rPr>
-                <w:sz w:val="13"/>
-              </w:rPr>
-              <w:t>106 L/s</w:t>
-            </w:r>
-          </w:p>
-        </w:tc>
-        <w:tc>
-          <w:tcPr>
-            <w:tcW w:type="dxa" w:w="1255"/>
-          </w:tcPr>
-          <w:p>
-            <w:r/>
-            <w:r>
-              <w:rPr>
-                <w:sz w:val="13"/>
-              </w:rPr>
-              <w:t>Ø200 round</w:t>
-            </w:r>
-          </w:p>
-        </w:tc>
-        <w:tc>
-          <w:tcPr>
-            <w:tcW w:type="dxa" w:w="1255"/>
-          </w:tcPr>
-          <w:p>
-            <w:r/>
-            <w:r>
-              <w:rPr>
-                <w:sz w:val="13"/>
-              </w:rPr>
-              <w:t>200</w:t>
-            </w:r>
-          </w:p>
-        </w:tc>
-        <w:tc>
-          <w:tcPr>
-            <w:tcW w:type="dxa" w:w="1255"/>
-          </w:tcPr>
-          <w:p>
-            <w:r/>
-            <w:r>
-              <w:rPr>
-                <w:sz w:val="13"/>
-              </w:rPr>
-              <w:t>3.38 m/s</w:t>
-            </w:r>
-          </w:p>
-        </w:tc>
-        <w:tc>
-          <w:tcPr>
-            <w:tcW w:type="dxa" w:w="1255"/>
-          </w:tcPr>
-          <w:p>
-            <w:r/>
-            <w:r>
-              <w:rPr>
-                <w:sz w:val="13"/>
-              </w:rPr>
-              <w:t>0.80 Pa/m</w:t>
-            </w:r>
-          </w:p>
-        </w:tc>
-        <w:tc>
-          <w:tcPr>
-            <w:tcW w:type="dxa" w:w="1255"/>
-          </w:tcPr>
-          <w:p>
-            <w:r/>
-            <w:r>
-              <w:rPr>
-                <w:sz w:val="13"/>
-              </w:rPr>
-              <w:t>6.09</w:t>
-            </w:r>
-          </w:p>
-        </w:tc>
-        <w:tc>
-          <w:tcPr>
-            <w:tcW w:type="dxa" w:w="1255"/>
-          </w:tcPr>
-          <w:p>
-            <w:r/>
-            <w:r>
-              <w:rPr>
-                <w:sz w:val="13"/>
-              </w:rPr>
-              <w:t>7.3 Pa</w:t>
+              <w:t>7.2 Pa</w:t>
             </w:r>
           </w:p>
         </w:tc>
@@ -24625,7 +24541,7 @@
     <w:p/>
     <w:p>
       <w:r>
-        <w:t>Critical path: required ESP 72 Pa vs available 100 Pa - OK.</w:t>
+        <w:t>Critical path: required ESP 73 Pa vs available 100 Pa - OK.</w:t>
       </w:r>
     </w:p>
     <w:p>
@@ -24886,7 +24802,7 @@
               <w:rPr>
                 <w:sz w:val="13"/>
               </w:rPr>
-              <w:t>317 L/s</w:t>
+              <w:t>250 L/s</w:t>
             </w:r>
           </w:p>
         </w:tc>
@@ -24900,7 +24816,7 @@
               <w:rPr>
                 <w:sz w:val="13"/>
               </w:rPr>
-              <w:t>300x300</w:t>
+              <w:t>300x250</w:t>
             </w:r>
           </w:p>
         </w:tc>
@@ -24914,7 +24830,7 @@
               <w:rPr>
                 <w:sz w:val="13"/>
               </w:rPr>
-              <w:t>328</w:t>
+              <w:t>299</w:t>
             </w:r>
           </w:p>
         </w:tc>
@@ -24928,7 +24844,7 @@
               <w:rPr>
                 <w:sz w:val="13"/>
               </w:rPr>
-              <w:t>3.52 m/s</w:t>
+              <w:t>3.33 m/s</w:t>
             </w:r>
           </w:p>
         </w:tc>
@@ -24942,7 +24858,7 @@
               <w:rPr>
                 <w:sz w:val="13"/>
               </w:rPr>
-              <w:t>0.52 Pa/m</w:t>
+              <w:t>0.53 Pa/m</w:t>
             </w:r>
           </w:p>
         </w:tc>
@@ -24956,7 +24872,7 @@
               <w:rPr>
                 <w:sz w:val="13"/>
               </w:rPr>
-              <w:t>4.43</w:t>
+              <w:t>4.37</w:t>
             </w:r>
           </w:p>
         </w:tc>
@@ -24970,7 +24886,7 @@
               <w:rPr>
                 <w:sz w:val="13"/>
               </w:rPr>
-              <w:t>3.4 Pa</w:t>
+              <w:t>3.5 Pa</w:t>
             </w:r>
           </w:p>
         </w:tc>
@@ -25042,7 +24958,7 @@
               <w:rPr>
                 <w:sz w:val="13"/>
               </w:rPr>
-              <w:t>317 L/s</w:t>
+              <w:t>250 L/s</w:t>
             </w:r>
           </w:p>
         </w:tc>
@@ -25056,7 +24972,7 @@
               <w:rPr>
                 <w:sz w:val="13"/>
               </w:rPr>
-              <w:t>350x300</w:t>
+              <w:t>300x300</w:t>
             </w:r>
           </w:p>
         </w:tc>
@@ -25070,7 +24986,7 @@
               <w:rPr>
                 <w:sz w:val="13"/>
               </w:rPr>
-              <w:t>354</w:t>
+              <w:t>328</w:t>
             </w:r>
           </w:p>
         </w:tc>
@@ -25084,7 +25000,7 @@
               <w:rPr>
                 <w:sz w:val="13"/>
               </w:rPr>
-              <w:t>3.02 m/s</w:t>
+              <w:t>2.78 m/s</w:t>
             </w:r>
           </w:p>
         </w:tc>
@@ -25098,7 +25014,7 @@
               <w:rPr>
                 <w:sz w:val="13"/>
               </w:rPr>
-              <w:t>0.36 Pa/m</w:t>
+              <w:t>0.34 Pa/m</w:t>
             </w:r>
           </w:p>
         </w:tc>
@@ -25112,7 +25028,7 @@
               <w:rPr>
                 <w:sz w:val="13"/>
               </w:rPr>
-              <w:t>1.43</w:t>
+              <w:t>1.37</w:t>
             </w:r>
           </w:p>
         </w:tc>
@@ -25126,7 +25042,7 @@
               <w:rPr>
                 <w:sz w:val="13"/>
               </w:rPr>
-              <w:t>0.8 Pa</w:t>
+              <w:t>0.7 Pa</w:t>
             </w:r>
           </w:p>
         </w:tc>
@@ -25140,7 +25056,7 @@
               <w:rPr>
                 <w:sz w:val="13"/>
               </w:rPr>
-              <w:t>24 ga (0.70 mm)</w:t>
+              <w:t>26 ga (0.55 mm)</w:t>
             </w:r>
           </w:p>
         </w:tc>
@@ -25198,7 +25114,7 @@
               <w:rPr>
                 <w:sz w:val="13"/>
               </w:rPr>
-              <w:t>158 L/s</w:t>
+              <w:t>125 L/s</w:t>
             </w:r>
           </w:p>
         </w:tc>
@@ -25240,7 +25156,7 @@
               <w:rPr>
                 <w:sz w:val="13"/>
               </w:rPr>
-              <w:t>2.24 m/s</w:t>
+              <w:t>1.77 m/s</w:t>
             </w:r>
           </w:p>
         </w:tc>
@@ -25254,7 +25170,7 @@
               <w:rPr>
                 <w:sz w:val="13"/>
               </w:rPr>
-              <w:t>0.23 Pa/m</w:t>
+              <w:t>0.15 Pa/m</w:t>
             </w:r>
           </w:p>
         </w:tc>
@@ -25268,7 +25184,7 @@
               <w:rPr>
                 <w:sz w:val="13"/>
               </w:rPr>
-              <w:t>1.47</w:t>
+              <w:t>1.44</w:t>
             </w:r>
           </w:p>
         </w:tc>
@@ -25282,7 +25198,7 @@
               <w:rPr>
                 <w:sz w:val="13"/>
               </w:rPr>
-              <w:t>0.5 Pa</w:t>
+              <w:t>0.3 Pa</w:t>
             </w:r>
           </w:p>
         </w:tc>
@@ -25354,7 +25270,7 @@
               <w:rPr>
                 <w:sz w:val="13"/>
               </w:rPr>
-              <w:t>158 L/s</w:t>
+              <w:t>125 L/s</w:t>
             </w:r>
           </w:p>
         </w:tc>
@@ -25396,7 +25312,7 @@
               <w:rPr>
                 <w:sz w:val="13"/>
               </w:rPr>
-              <w:t>2.24 m/s</w:t>
+              <w:t>1.77 m/s</w:t>
             </w:r>
           </w:p>
         </w:tc>
@@ -25410,7 +25326,7 @@
               <w:rPr>
                 <w:sz w:val="13"/>
               </w:rPr>
-              <w:t>0.23 Pa/m</w:t>
+              <w:t>0.15 Pa/m</w:t>
             </w:r>
           </w:p>
         </w:tc>
@@ -25424,7 +25340,7 @@
               <w:rPr>
                 <w:sz w:val="13"/>
               </w:rPr>
-              <w:t>1.47</w:t>
+              <w:t>1.44</w:t>
             </w:r>
           </w:p>
         </w:tc>
@@ -25438,7 +25354,7 @@
               <w:rPr>
                 <w:sz w:val="13"/>
               </w:rPr>
-              <w:t>0.5 Pa</w:t>
+              <w:t>0.3 Pa</w:t>
             </w:r>
           </w:p>
         </w:tc>
@@ -25510,7 +25426,7 @@
               <w:rPr>
                 <w:sz w:val="13"/>
               </w:rPr>
-              <w:t>380 L/s</w:t>
+              <w:t>300 L/s</w:t>
             </w:r>
           </w:p>
         </w:tc>
@@ -25524,7 +25440,7 @@
               <w:rPr>
                 <w:sz w:val="13"/>
               </w:rPr>
-              <w:t>400x300</w:t>
+              <w:t>350x300</w:t>
             </w:r>
           </w:p>
         </w:tc>
@@ -25538,7 +25454,7 @@
               <w:rPr>
                 <w:sz w:val="13"/>
               </w:rPr>
-              <w:t>378</w:t>
+              <w:t>354</w:t>
             </w:r>
           </w:p>
         </w:tc>
@@ -25552,7 +25468,7 @@
               <w:rPr>
                 <w:sz w:val="13"/>
               </w:rPr>
-              <w:t>3.17 m/s</w:t>
+              <w:t>2.86 m/s</w:t>
             </w:r>
           </w:p>
         </w:tc>
@@ -25566,7 +25482,7 @@
               <w:rPr>
                 <w:sz w:val="13"/>
               </w:rPr>
-              <w:t>0.36 Pa/m</w:t>
+              <w:t>0.32 Pa/m</w:t>
             </w:r>
           </w:p>
         </w:tc>
@@ -25708,7 +25624,7 @@
               <w:rPr>
                 <w:sz w:val="13"/>
               </w:rPr>
-              <w:t>1.64 m/s</w:t>
+              <w:t>1.62 m/s</w:t>
             </w:r>
           </w:p>
         </w:tc>
@@ -25722,7 +25638,7 @@
               <w:rPr>
                 <w:sz w:val="13"/>
               </w:rPr>
-              <w:t>0.39 Pa/m</w:t>
+              <w:t>0.38 Pa/m</w:t>
             </w:r>
           </w:p>
         </w:tc>
@@ -25736,7 +25652,7 @@
               <w:rPr>
                 <w:sz w:val="13"/>
               </w:rPr>
-              <w:t>3.89</w:t>
+              <w:t>3.79</w:t>
             </w:r>
           </w:p>
         </w:tc>
@@ -25750,7 +25666,7 @@
               <w:rPr>
                 <w:sz w:val="13"/>
               </w:rPr>
-              <w:t>2.3 Pa</w:t>
+              <w:t>2.2 Pa</w:t>
             </w:r>
           </w:p>
         </w:tc>
@@ -26190,7 +26106,7 @@
               <w:rPr>
                 <w:sz w:val="13"/>
               </w:rPr>
-              <w:t>375 L/s</w:t>
+              <w:t>372 L/s</w:t>
             </w:r>
           </w:p>
         </w:tc>
@@ -26232,7 +26148,7 @@
               <w:rPr>
                 <w:sz w:val="13"/>
               </w:rPr>
-              <w:t>4.16 m/s</w:t>
+              <w:t>4.13 m/s</w:t>
             </w:r>
           </w:p>
         </w:tc>
@@ -26246,7 +26162,7 @@
               <w:rPr>
                 <w:sz w:val="13"/>
               </w:rPr>
-              <w:t>0.70 Pa/m</w:t>
+              <w:t>0.69 Pa/m</w:t>
             </w:r>
           </w:p>
         </w:tc>
@@ -26260,7 +26176,7 @@
               <w:rPr>
                 <w:sz w:val="13"/>
               </w:rPr>
-              <w:t>4.34</w:t>
+              <w:t>4.28</w:t>
             </w:r>
           </w:p>
         </w:tc>
@@ -26274,7 +26190,7 @@
               <w:rPr>
                 <w:sz w:val="13"/>
               </w:rPr>
-              <w:t>4.6 Pa</w:t>
+              <w:t>4.4 Pa</w:t>
             </w:r>
           </w:p>
         </w:tc>
@@ -26346,7 +26262,7 @@
               <w:rPr>
                 <w:sz w:val="13"/>
               </w:rPr>
-              <w:t>289 L/s</w:t>
+              <w:t>292 L/s</w:t>
             </w:r>
           </w:p>
         </w:tc>
@@ -26388,7 +26304,7 @@
               <w:rPr>
                 <w:sz w:val="13"/>
               </w:rPr>
-              <w:t>3.85 m/s</w:t>
+              <w:t>3.89 m/s</w:t>
             </w:r>
           </w:p>
         </w:tc>
@@ -26402,7 +26318,7 @@
               <w:rPr>
                 <w:sz w:val="13"/>
               </w:rPr>
-              <w:t>0.69 Pa/m</w:t>
+              <w:t>0.70 Pa/m</w:t>
             </w:r>
           </w:p>
         </w:tc>
@@ -26502,7 +26418,7 @@
               <w:rPr>
                 <w:sz w:val="13"/>
               </w:rPr>
-              <w:t>232 L/s</w:t>
+              <w:t>235 L/s</w:t>
             </w:r>
           </w:p>
         </w:tc>
@@ -26544,7 +26460,7 @@
               <w:rPr>
                 <w:sz w:val="13"/>
               </w:rPr>
-              <w:t>3.71 m/s</w:t>
+              <w:t>3.76 m/s</w:t>
             </w:r>
           </w:p>
         </w:tc>
@@ -26558,7 +26474,7 @@
               <w:rPr>
                 <w:sz w:val="13"/>
               </w:rPr>
-              <w:t>0.71 Pa/m</w:t>
+              <w:t>0.73 Pa/m</w:t>
             </w:r>
           </w:p>
         </w:tc>
@@ -26586,7 +26502,7 @@
               <w:rPr>
                 <w:sz w:val="13"/>
               </w:rPr>
-              <w:t>1.1 Pa</w:t>
+              <w:t>1.2 Pa</w:t>
             </w:r>
           </w:p>
         </w:tc>
@@ -26658,7 +26574,7 @@
               <w:rPr>
                 <w:sz w:val="13"/>
               </w:rPr>
-              <w:t>113 L/s</w:t>
+              <w:t>117 L/s</w:t>
             </w:r>
           </w:p>
         </w:tc>
@@ -26700,7 +26616,7 @@
               <w:rPr>
                 <w:sz w:val="13"/>
               </w:rPr>
-              <w:t>2.81 m/s</w:t>
+              <w:t>2.92 m/s</w:t>
             </w:r>
           </w:p>
         </w:tc>
@@ -26714,7 +26630,7 @@
               <w:rPr>
                 <w:sz w:val="13"/>
               </w:rPr>
-              <w:t>0.57 Pa/m</w:t>
+              <w:t>0.61 Pa/m</w:t>
             </w:r>
           </w:p>
         </w:tc>
@@ -26728,7 +26644,7 @@
               <w:rPr>
                 <w:sz w:val="13"/>
               </w:rPr>
-              <w:t>2.92</w:t>
+              <w:t>2.87</w:t>
             </w:r>
           </w:p>
         </w:tc>
@@ -26742,7 +26658,7 @@
               <w:rPr>
                 <w:sz w:val="13"/>
               </w:rPr>
-              <w:t>2.5 Pa</w:t>
+              <w:t>2.6 Pa</w:t>
             </w:r>
           </w:p>
         </w:tc>
@@ -26814,7 +26730,7 @@
               <w:rPr>
                 <w:sz w:val="13"/>
               </w:rPr>
-              <w:t>375 L/s</w:t>
+              <w:t>372 L/s</w:t>
             </w:r>
           </w:p>
         </w:tc>
@@ -26856,7 +26772,7 @@
               <w:rPr>
                 <w:sz w:val="13"/>
               </w:rPr>
-              <w:t>3.12 m/s</w:t>
+              <w:t>3.10 m/s</w:t>
             </w:r>
           </w:p>
         </w:tc>
@@ -26884,7 +26800,7 @@
               <w:rPr>
                 <w:sz w:val="13"/>
               </w:rPr>
-              <w:t>0.9</w:t>
+              <w:t>0.86</w:t>
             </w:r>
           </w:p>
         </w:tc>
@@ -26898,7 +26814,7 @@
               <w:rPr>
                 <w:sz w:val="13"/>
               </w:rPr>
-              <w:t>0.5 Pa</w:t>
+              <w:t>0.4 Pa</w:t>
             </w:r>
           </w:p>
         </w:tc>
@@ -26970,7 +26886,7 @@
               <w:rPr>
                 <w:sz w:val="13"/>
               </w:rPr>
-              <w:t>125 L/s</w:t>
+              <w:t>124 L/s</w:t>
             </w:r>
           </w:p>
         </w:tc>
@@ -27012,7 +26928,7 @@
               <w:rPr>
                 <w:sz w:val="13"/>
               </w:rPr>
-              <w:t>1.77 m/s</w:t>
+              <w:t>1.75 m/s</w:t>
             </w:r>
           </w:p>
         </w:tc>
@@ -27040,7 +26956,7 @@
               <w:rPr>
                 <w:sz w:val="13"/>
               </w:rPr>
-              <w:t>1.97</w:t>
+              <w:t>1.94</w:t>
             </w:r>
           </w:p>
         </w:tc>
@@ -27126,7 +27042,7 @@
               <w:rPr>
                 <w:sz w:val="13"/>
               </w:rPr>
-              <w:t>125 L/s</w:t>
+              <w:t>124 L/s</w:t>
             </w:r>
           </w:p>
         </w:tc>
@@ -27168,7 +27084,7 @@
               <w:rPr>
                 <w:sz w:val="13"/>
               </w:rPr>
-              <w:t>1.77 m/s</w:t>
+              <w:t>1.75 m/s</w:t>
             </w:r>
           </w:p>
         </w:tc>
@@ -27196,7 +27112,7 @@
               <w:rPr>
                 <w:sz w:val="13"/>
               </w:rPr>
-              <w:t>2.8</w:t>
+              <w:t>2.75</w:t>
             </w:r>
           </w:p>
         </w:tc>
@@ -27282,7 +27198,7 @@
               <w:rPr>
                 <w:sz w:val="13"/>
               </w:rPr>
-              <w:t>125 L/s</w:t>
+              <w:t>124 L/s</w:t>
             </w:r>
           </w:p>
         </w:tc>
@@ -27324,7 +27240,7 @@
               <w:rPr>
                 <w:sz w:val="13"/>
               </w:rPr>
-              <w:t>1.77 m/s</w:t>
+              <w:t>1.75 m/s</w:t>
             </w:r>
           </w:p>
         </w:tc>
@@ -27352,7 +27268,7 @@
               <w:rPr>
                 <w:sz w:val="13"/>
               </w:rPr>
-              <w:t>3.12</w:t>
+              <w:t>3.06</w:t>
             </w:r>
           </w:p>
         </w:tc>
@@ -27508,7 +27424,7 @@
               <w:rPr>
                 <w:sz w:val="13"/>
               </w:rPr>
-              <w:t>2.68</w:t>
+              <w:t>2.67</w:t>
             </w:r>
           </w:p>
         </w:tc>
@@ -27522,7 +27438,7 @@
               <w:rPr>
                 <w:sz w:val="13"/>
               </w:rPr>
-              <w:t>1.7 Pa</w:t>
+              <w:t>1.6 Pa</w:t>
             </w:r>
           </w:p>
         </w:tc>
@@ -27792,7 +27708,7 @@
               <w:rPr>
                 <w:sz w:val="13"/>
               </w:rPr>
-              <w:t>2.54 m/s</w:t>
+              <w:t>2.53 m/s</w:t>
             </w:r>
           </w:p>
         </w:tc>
@@ -27820,7 +27736,7 @@
               <w:rPr>
                 <w:sz w:val="13"/>
               </w:rPr>
-              <w:t>0.25</w:t>
+              <w:t>0.24</w:t>
             </w:r>
           </w:p>
         </w:tc>
@@ -27834,7 +27750,7 @@
               <w:rPr>
                 <w:sz w:val="13"/>
               </w:rPr>
-              <w:t>0.3 Pa</w:t>
+              <w:t>0.2 Pa</w:t>
             </w:r>
           </w:p>
         </w:tc>
@@ -27906,7 +27822,7 @@
               <w:rPr>
                 <w:sz w:val="13"/>
               </w:rPr>
-              <w:t>119 L/s</w:t>
+              <w:t>118 L/s</w:t>
             </w:r>
           </w:p>
         </w:tc>
@@ -27948,7 +27864,7 @@
               <w:rPr>
                 <w:sz w:val="13"/>
               </w:rPr>
-              <w:t>2.97 m/s</w:t>
+              <w:t>2.95 m/s</w:t>
             </w:r>
           </w:p>
         </w:tc>
@@ -27962,7 +27878,7 @@
               <w:rPr>
                 <w:sz w:val="13"/>
               </w:rPr>
-              <w:t>0.63 Pa/m</w:t>
+              <w:t>0.62 Pa/m</w:t>
             </w:r>
           </w:p>
         </w:tc>
@@ -27976,7 +27892,7 @@
               <w:rPr>
                 <w:sz w:val="13"/>
               </w:rPr>
-              <w:t>4.47</w:t>
+              <w:t>4.42</w:t>
             </w:r>
           </w:p>
         </w:tc>
@@ -27990,7 +27906,7 @@
               <w:rPr>
                 <w:sz w:val="13"/>
               </w:rPr>
-              <w:t>4.2 Pa</w:t>
+              <w:t>4.1 Pa</w:t>
             </w:r>
           </w:p>
         </w:tc>
@@ -28062,7 +27978,7 @@
               <w:rPr>
                 <w:sz w:val="13"/>
               </w:rPr>
-              <w:t>60 L/s</w:t>
+              <w:t>59 L/s</w:t>
             </w:r>
           </w:p>
         </w:tc>
@@ -28104,7 +28020,7 @@
               <w:rPr>
                 <w:sz w:val="13"/>
               </w:rPr>
-              <w:t>1.89 m/s</w:t>
+              <w:t>1.88 m/s</w:t>
             </w:r>
           </w:p>
         </w:tc>
@@ -28132,7 +28048,7 @@
               <w:rPr>
                 <w:sz w:val="13"/>
               </w:rPr>
-              <w:t>1.22</w:t>
+              <w:t>1.19</w:t>
             </w:r>
           </w:p>
         </w:tc>
@@ -28218,7 +28134,7 @@
               <w:rPr>
                 <w:sz w:val="13"/>
               </w:rPr>
-              <w:t>60 L/s</w:t>
+              <w:t>59 L/s</w:t>
             </w:r>
           </w:p>
         </w:tc>
@@ -28260,7 +28176,7 @@
               <w:rPr>
                 <w:sz w:val="13"/>
               </w:rPr>
-              <w:t>1.89 m/s</w:t>
+              <w:t>1.88 m/s</w:t>
             </w:r>
           </w:p>
         </w:tc>
@@ -28288,7 +28204,7 @@
               <w:rPr>
                 <w:sz w:val="13"/>
               </w:rPr>
-              <w:t>1.22</w:t>
+              <w:t>1.19</w:t>
             </w:r>
           </w:p>
         </w:tc>
@@ -28530,7 +28446,7 @@
               <w:rPr>
                 <w:sz w:val="13"/>
               </w:rPr>
-              <w:t>93 L/s</w:t>
+              <w:t>92 L/s</w:t>
             </w:r>
           </w:p>
         </w:tc>
@@ -28572,7 +28488,7 @@
               <w:rPr>
                 <w:sz w:val="13"/>
               </w:rPr>
-              <w:t>2.95 m/s</w:t>
+              <w:t>2.94 m/s</w:t>
             </w:r>
           </w:p>
         </w:tc>
@@ -28600,7 +28516,7 @@
               <w:rPr>
                 <w:sz w:val="13"/>
               </w:rPr>
-              <w:t>6.12</w:t>
+              <w:t>6.05</w:t>
             </w:r>
           </w:p>
         </w:tc>
@@ -28614,7 +28530,7 @@
               <w:rPr>
                 <w:sz w:val="13"/>
               </w:rPr>
-              <w:t>5.7 Pa</w:t>
+              <w:t>5.6 Pa</w:t>
             </w:r>
           </w:p>
         </w:tc>
@@ -28637,7 +28553,7 @@
     <w:p/>
     <w:p>
       <w:r>
-        <w:t>Critical path: required ESP 73 Pa vs available 100 Pa - OK.</w:t>
+        <w:t>Critical path: required ESP 74 Pa vs available 100 Pa - OK.</w:t>
       </w:r>
     </w:p>
     <w:p>
@@ -28985,7 +28901,7 @@
               <w:rPr>
                 <w:sz w:val="14"/>
               </w:rPr>
-              <w:t>121 L/s</w:t>
+              <w:t>122 L/s</w:t>
             </w:r>
           </w:p>
         </w:tc>
@@ -29071,7 +28987,7 @@
               <w:rPr>
                 <w:sz w:val="14"/>
               </w:rPr>
-              <w:t>121 L/s</w:t>
+              <w:t>122 L/s</w:t>
             </w:r>
           </w:p>
         </w:tc>
@@ -29515,7 +29431,7 @@
               <w:rPr>
                 <w:sz w:val="14"/>
               </w:rPr>
-              <w:t>26</w:t>
+              <w:t>25</w:t>
             </w:r>
           </w:p>
         </w:tc>
@@ -29529,7 +29445,7 @@
               <w:rPr>
                 <w:sz w:val="14"/>
               </w:rPr>
-              <w:t>2.6</w:t>
+              <w:t>2.5</w:t>
             </w:r>
           </w:p>
         </w:tc>
@@ -29601,7 +29517,7 @@
               <w:rPr>
                 <w:sz w:val="14"/>
               </w:rPr>
-              <w:t>26</w:t>
+              <w:t>25</w:t>
             </w:r>
           </w:p>
         </w:tc>
@@ -29615,7 +29531,7 @@
               <w:rPr>
                 <w:sz w:val="14"/>
               </w:rPr>
-              <w:t>2.6</w:t>
+              <w:t>2.5</w:t>
             </w:r>
           </w:p>
         </w:tc>
@@ -29673,7 +29589,7 @@
               <w:rPr>
                 <w:sz w:val="14"/>
               </w:rPr>
-              <w:t>158 L/s</w:t>
+              <w:t>125 L/s</w:t>
             </w:r>
           </w:p>
         </w:tc>
@@ -29687,7 +29603,7 @@
               <w:rPr>
                 <w:sz w:val="14"/>
               </w:rPr>
-              <w:t>24</w:t>
+              <w:t>19</w:t>
             </w:r>
           </w:p>
         </w:tc>
@@ -29701,7 +29617,7 @@
               <w:rPr>
                 <w:sz w:val="14"/>
               </w:rPr>
-              <w:t>2.4</w:t>
+              <w:t>1.9</w:t>
             </w:r>
           </w:p>
         </w:tc>
@@ -29759,7 +29675,7 @@
               <w:rPr>
                 <w:sz w:val="14"/>
               </w:rPr>
-              <w:t>158 L/s</w:t>
+              <w:t>125 L/s</w:t>
             </w:r>
           </w:p>
         </w:tc>
@@ -29773,7 +29689,7 @@
               <w:rPr>
                 <w:sz w:val="14"/>
               </w:rPr>
-              <w:t>24</w:t>
+              <w:t>19</w:t>
             </w:r>
           </w:p>
         </w:tc>
@@ -29787,7 +29703,7 @@
               <w:rPr>
                 <w:sz w:val="14"/>
               </w:rPr>
-              <w:t>2.4</w:t>
+              <w:t>1.9</w:t>
             </w:r>
           </w:p>
         </w:tc>
@@ -29845,7 +29761,7 @@
               <w:rPr>
                 <w:sz w:val="14"/>
               </w:rPr>
-              <w:t>63 L/s</w:t>
+              <w:t>50 L/s</w:t>
             </w:r>
           </w:p>
         </w:tc>
@@ -29859,7 +29775,7 @@
               <w:rPr>
                 <w:sz w:val="14"/>
               </w:rPr>
-              <w:t>22</w:t>
+              <w:t>18</w:t>
             </w:r>
           </w:p>
         </w:tc>
@@ -29873,7 +29789,7 @@
               <w:rPr>
                 <w:sz w:val="14"/>
               </w:rPr>
-              <w:t>1.5</w:t>
+              <w:t>1.2</w:t>
             </w:r>
           </w:p>
         </w:tc>
@@ -29931,7 +29847,7 @@
               <w:rPr>
                 <w:sz w:val="14"/>
               </w:rPr>
-              <w:t>125 L/s</w:t>
+              <w:t>124 L/s</w:t>
             </w:r>
           </w:p>
         </w:tc>
@@ -30017,7 +29933,7 @@
               <w:rPr>
                 <w:sz w:val="14"/>
               </w:rPr>
-              <w:t>125 L/s</w:t>
+              <w:t>124 L/s</w:t>
             </w:r>
           </w:p>
         </w:tc>
@@ -30103,7 +30019,7 @@
               <w:rPr>
                 <w:sz w:val="14"/>
               </w:rPr>
-              <w:t>125 L/s</w:t>
+              <w:t>124 L/s</w:t>
             </w:r>
           </w:p>
         </w:tc>
@@ -30447,7 +30363,7 @@
               <w:rPr>
                 <w:sz w:val="14"/>
               </w:rPr>
-              <w:t>60 L/s</w:t>
+              <w:t>59 L/s</w:t>
             </w:r>
           </w:p>
         </w:tc>
@@ -30533,7 +30449,7 @@
               <w:rPr>
                 <w:sz w:val="14"/>
               </w:rPr>
-              <w:t>60 L/s</w:t>
+              <w:t>59 L/s</w:t>
             </w:r>
           </w:p>
         </w:tc>
@@ -30605,7 +30521,7 @@
               <w:rPr>
                 <w:sz w:val="14"/>
               </w:rPr>
-              <w:t>SD-200</w:t>
+              <w:t>SD-250</w:t>
             </w:r>
           </w:p>
         </w:tc>
@@ -30619,7 +30535,7 @@
               <w:rPr>
                 <w:sz w:val="14"/>
               </w:rPr>
-              <w:t>113 L/s</w:t>
+              <w:t>117 L/s</w:t>
             </w:r>
           </w:p>
         </w:tc>
@@ -30633,7 +30549,7 @@
               <w:rPr>
                 <w:sz w:val="14"/>
               </w:rPr>
-              <w:t>24</w:t>
+              <w:t>18</w:t>
             </w:r>
           </w:p>
         </w:tc>
@@ -30647,7 +30563,7 @@
               <w:rPr>
                 <w:sz w:val="14"/>
               </w:rPr>
-              <w:t>2.1</w:t>
+              <w:t>1.8</w:t>
             </w:r>
           </w:p>
         </w:tc>
@@ -30933,7 +30849,7 @@
               <w:rPr>
                 <w:sz w:val="14"/>
               </w:rPr>
-              <w:t>4.41</w:t>
+              <w:t>4.32</w:t>
             </w:r>
           </w:p>
         </w:tc>
@@ -30961,7 +30877,7 @@
               <w:rPr>
                 <w:sz w:val="14"/>
               </w:rPr>
-              <w:t>46 Pa</w:t>
+              <w:t>45 Pa</w:t>
             </w:r>
           </w:p>
         </w:tc>
@@ -31075,7 +30991,7 @@
               <w:rPr>
                 <w:sz w:val="14"/>
               </w:rPr>
-              <w:t>1.48</w:t>
+              <w:t>1.21</w:t>
             </w:r>
           </w:p>
         </w:tc>
@@ -31359,7 +31275,7 @@
               <w:rPr>
                 <w:sz w:val="14"/>
               </w:rPr>
-              <w:t>1.78</w:t>
+              <w:t>1.68</w:t>
             </w:r>
           </w:p>
         </w:tc>
@@ -31387,7 +31303,7 @@
               <w:rPr>
                 <w:sz w:val="14"/>
               </w:rPr>
-              <w:t>42 Pa</w:t>
+              <w:t>41 Pa</w:t>
             </w:r>
           </w:p>
         </w:tc>
@@ -31501,7 +31417,7 @@
               <w:rPr>
                 <w:sz w:val="14"/>
               </w:rPr>
-              <w:t>2.27</w:t>
+              <w:t>2.17</w:t>
             </w:r>
           </w:p>
         </w:tc>
@@ -31643,7 +31559,7 @@
               <w:rPr>
                 <w:sz w:val="14"/>
               </w:rPr>
-              <w:t>1.22</w:t>
+              <w:t>1.14</w:t>
             </w:r>
           </w:p>
         </w:tc>
@@ -31785,7 +31701,7 @@
               <w:rPr>
                 <w:sz w:val="14"/>
               </w:rPr>
-              <w:t>1.48</w:t>
+              <w:t>1.21</w:t>
             </w:r>
           </w:p>
         </w:tc>
@@ -31927,7 +31843,7 @@
               <w:rPr>
                 <w:sz w:val="14"/>
               </w:rPr>
-              <w:t>1.24</w:t>
+              <w:t>1.14</w:t>
             </w:r>
           </w:p>
         </w:tc>
@@ -32395,7 +32311,7 @@
               <w:rPr>
                 <w:sz w:val="14"/>
               </w:rPr>
-              <w:t>2.63</w:t>
+              <w:t>4.43</w:t>
             </w:r>
           </w:p>
         </w:tc>
@@ -32437,7 +32353,7 @@
               <w:rPr>
                 <w:sz w:val="14"/>
               </w:rPr>
-              <w:t>14.6</w:t>
+              <w:t>16.5</w:t>
             </w:r>
           </w:p>
         </w:tc>
@@ -32793,7 +32709,7 @@
               <w:rPr>
                 <w:sz w:val="14"/>
               </w:rPr>
-              <w:t>7.0 kW</w:t>
+              <w:t>5.3 kW</w:t>
             </w:r>
           </w:p>
         </w:tc>
@@ -32807,7 +32723,7 @@
               <w:rPr>
                 <w:sz w:val="14"/>
               </w:rPr>
-              <w:t>9.52 / 15.88 (3/8" / 5/8")</w:t>
+              <w:t>6.35 / 12.7 (1/4" / 1/2")</w:t>
             </w:r>
           </w:p>
         </w:tc>
@@ -33368,7 +33284,7 @@
               <w:rPr>
                 <w:sz w:val="14"/>
               </w:rPr>
-              <w:t>2.9</w:t>
+              <w:t>4.87</w:t>
             </w:r>
           </w:p>
         </w:tc>
@@ -33668,7 +33584,7 @@
               <w:rPr>
                 <w:sz w:val="14"/>
               </w:rPr>
-              <w:t>2.69</w:t>
+              <w:t>2.68</w:t>
             </w:r>
           </w:p>
         </w:tc>
@@ -33768,7 +33684,7 @@
               <w:rPr>
                 <w:sz w:val="14"/>
               </w:rPr>
-              <w:t>6.24</w:t>
+              <w:t>6.23</w:t>
             </w:r>
           </w:p>
         </w:tc>
@@ -33995,7 +33911,7 @@
               <w:rPr>
                 <w:sz w:val="15"/>
               </w:rPr>
-              <w:t>supply = unit airflow in all ducted zones; building OA 274.9 L/s vs exhaust 225.0 L/s (net +50 L/s)</w:t>
+              <w:t>supply = unit airflow in all ducted zones; building OA 271.0 L/s vs exhaust 225.0 L/s (net +46 L/s)</w:t>
             </w:r>
           </w:p>
         </w:tc>

</xml_diff>